<commit_message>
DOCX neu gebaut nach Lektorat-Korrekturen
7 Grammatik/Orthographie-Fehler behoben (eingeschalten→eingeschaltet,
Eine→Ein letzter Gedanke, Viele→Vielen, weiß→weiss, derjenigen→diejenige,
kein→keine Beobachtung, klangen-Präteritum). DOCX aus korrigiertem
Manuskript neu generiert.

Co-Authored-By: Claude Sonnet 4.6 <noreply@anthropic.com>
Claude-Session: https://claude.ai/code/session_011oFtWvyjvkDdc6K2GcSXHx
</commit_message>
<xml_diff>
--- a/outputs/buch-beziehungen/wenn-beziehungen-erschoepfen-KDP.docx
+++ b/outputs/buch-beziehungen/wenn-beziehungen-erschoepfen-KDP.docx
@@ -1276,7 +1276,7 @@
         <w:ind w:firstLine="283"/>
       </w:pPr>
       <w:r>
-        <w:t>Franziska lernte, noch bevor sie das Haus betrat, ob es ein guter oder schlechter Abend war. Sie hörte, wie die Mutter in der Küche hantierte. Wie die Schranktüren klangen. Wie die Schritte klingen. „Ich konnte es an allem ablesen," sagte sie mir. „Der Ton, in dem sie Guten Abend sagte. Ob sie mich anschaute oder nicht."</w:t>
+        <w:t>Franziska lernte, noch bevor sie das Haus betrat, ob es ein guter oder schlechter Abend war. Sie hörte, wie die Mutter in der Küche hantierte. Wie die Schranktüren klangen. Wie die Schritte klangen. „Ich konnte es an allem ablesen," sagte sie mir. „Der Ton, in dem sie Guten Abend sagte. Ob sie mich anschaute oder nicht."</w:t>
       </w:r>
     </w:p>
     <w:p>
@@ -3312,7 +3312,7 @@
         <w:ind w:firstLine="283"/>
       </w:pPr>
       <w:r>
-        <w:t>Frauen mit People-Pleasing-Muster sagen sehr oft Ja, bevor sie sich gefragt haben, ob sie das wollen. Das Ja kommt automatisch, bevor der Verstand überhaupt eingeschalten hat. Die Pause unterbricht das.</w:t>
+        <w:t>Frauen mit People-Pleasing-Muster sagen sehr oft Ja, bevor sie sich gefragt haben, ob sie das wollen. Das Ja kommt automatisch, bevor der Verstand überhaupt eingeschaltet hat. Die Pause unterbricht das.</w:t>
       </w:r>
     </w:p>
     <w:p>
@@ -3424,7 +3424,7 @@
         <w:ind w:firstLine="283"/>
       </w:pPr>
       <w:r>
-        <w:t>Eine letzte Gedanke zu Grenzen, der mir wichtig ist.</w:t>
+        <w:t>Ein letzter Gedanke zu Grenzen, der mir wichtig ist.</w:t>
       </w:r>
     </w:p>
     <w:p>
@@ -4355,7 +4355,7 @@
         <w:ind w:firstLine="283"/>
       </w:pPr>
       <w:r>
-        <w:t>Viele stellt die Frage, die irgendwann kommt, wenn man diesen Weg geht: Wenn ich aufhöre, die Retterin zu sein, die Märtyrerin — wer bin ich dann?</w:t>
+        <w:t>Vielen stellt sich die Frage, die irgendwann kommt, wenn man diesen Weg geht: Wenn ich aufhöre, die Retterin zu sein, die Märtyrerin — wer bin ich dann?</w:t>
       </w:r>
     </w:p>
     <w:p>
@@ -6188,7 +6188,7 @@
         <w:pStyle w:val="Heading2"/>
       </w:pPr>
       <w:r>
-        <w:t>Die zweite Geschichte: wenn der Körper das weiß, was der Kopf verdrängt hat</w:t>
+        <w:t>Die zweite Geschichte: wenn der Körper das weiss, was der Kopf verdrängt hat</w:t>
       </w:r>
     </w:p>
     <w:p>
@@ -6842,7 +6842,7 @@
         <w:t>Öffentlich anders als privat.</w:t>
       </w:r>
       <w:r>
-        <w:t xml:space="preserve"> Nach aussen ist er charmant, beliebt, gut angesehen. Auf Partys hilft er, lacht, ist aufmerksam. Nur du siehst das andere Gesicht. Wenn du davon erzählst, glauben dir andere oft nicht. Das verstärkt deine Isolation: Du fühlst dich verrückt. Du fragst dich, ob du derjenigen bist, die das Problem ist.</w:t>
+        <w:t xml:space="preserve"> Nach aussen ist er charmant, beliebt, gut angesehen. Auf Partys hilft er, lacht, ist aufmerksam. Nur du siehst das andere Gesicht. Wenn du davon erzählst, glauben dir andere oft nicht. Das verstärkt deine Isolation: Du fühlst dich verrückt. Du fragst dich, ob du diejenige bist, die das Problem ist.</w:t>
       </w:r>
     </w:p>
     <w:p>
@@ -7672,7 +7672,7 @@
         <w:t>Beobachtung statt Bewertung.</w:t>
       </w:r>
       <w:r>
-        <w:t xml:space="preserve"> Nicht: „Du ignorierst mich immer." Das ist eine Bewertung, kein Beobachtung. Und sie löst sofort Widerstand aus. Stattdessen: „Gestern Abend hast du drei Stunden auf dein Handy geschaut, während wir zusammen waren."</w:t>
+        <w:t xml:space="preserve"> Nicht: „Du ignorierst mich immer." Das ist eine Bewertung, keine Beobachtung. Und sie löst sofort Widerstand aus. Stattdessen: „Gestern Abend hast du drei Stunden auf dein Handy geschaut, während wir zusammen waren."</w:t>
       </w:r>
     </w:p>
     <w:p>

</xml_diff>

<commit_message>
Impressum rechtlich gestärkt (CH + DE), Copyright auf 2026 korrigiert
- Haftungsausschluss explizit ausformuliert (kein Therapieersatz, keine
  Haftung für Schäden, Empfehlung professioneller Hilfe bei Krisen)
- Fallbeispiele-Disclaimer präzisiert (Composite-Fälle, keine reale Person)
- Urheberrechtsklausel auf Standard-Formulierung erweitert
- Hinweis auf externe Links ergänzt
- Copyright 2025 → 2026 korrigiert
- Wohnort Schweiz angegeben (DE-Impressum-Anforderung)
- Manuskript und DOCX neu gebaut

Co-Authored-By: Claude Sonnet 4.6 <noreply@anthropic.com>
Claude-Session: https://claude.ai/code/session_011oFtWvyjvkDdc6K2GcSXHx
</commit_message>
<xml_diff>
--- a/outputs/buch-beziehungen/wenn-beziehungen-erschoepfen-KDP.docx
+++ b/outputs/buch-beziehungen/wenn-beziehungen-erschoepfen-KDP.docx
@@ -1276,7 +1276,7 @@
         <w:ind w:firstLine="283"/>
       </w:pPr>
       <w:r>
-        <w:t>Franziska lernte, noch bevor sie das Haus betrat, ob es ein guter oder schlechter Abend war. Sie hörte, wie die Mutter in der Küche hantierte. Wie die Schranktüren klangen. Wie die Schritte klangen. „Ich konnte es an allem ablesen," sagte sie mir. „Der Ton, in dem sie Guten Abend sagte. Ob sie mich anschaute oder nicht."</w:t>
+        <w:t>Franziska lernte, noch bevor sie das Haus betrat, ob es ein guter oder schlechter Abend war. Sie hörte, wie die Mutter in der Küche hantierte. Wie die Schranktüren klangen. Wie die Schritte klingen. „Ich konnte es an allem ablesen," sagte sie mir. „Der Ton, in dem sie Guten Abend sagte. Ob sie mich anschaute oder nicht."</w:t>
       </w:r>
     </w:p>
     <w:p>
@@ -3312,7 +3312,7 @@
         <w:ind w:firstLine="283"/>
       </w:pPr>
       <w:r>
-        <w:t>Frauen mit People-Pleasing-Muster sagen sehr oft Ja, bevor sie sich gefragt haben, ob sie das wollen. Das Ja kommt automatisch, bevor der Verstand überhaupt eingeschaltet hat. Die Pause unterbricht das.</w:t>
+        <w:t>Frauen mit People-Pleasing-Muster sagen sehr oft Ja, bevor sie sich gefragt haben, ob sie das wollen. Das Ja kommt automatisch, bevor der Verstand überhaupt eingeschalten hat. Die Pause unterbricht das.</w:t>
       </w:r>
     </w:p>
     <w:p>
@@ -3424,7 +3424,7 @@
         <w:ind w:firstLine="283"/>
       </w:pPr>
       <w:r>
-        <w:t>Ein letzter Gedanke zu Grenzen, der mir wichtig ist.</w:t>
+        <w:t>Eine letzte Gedanke zu Grenzen, der mir wichtig ist.</w:t>
       </w:r>
     </w:p>
     <w:p>
@@ -4355,7 +4355,7 @@
         <w:ind w:firstLine="283"/>
       </w:pPr>
       <w:r>
-        <w:t>Vielen stellt sich die Frage, die irgendwann kommt, wenn man diesen Weg geht: Wenn ich aufhöre, die Retterin zu sein, die Märtyrerin — wer bin ich dann?</w:t>
+        <w:t>Viele stellt die Frage, die irgendwann kommt, wenn man diesen Weg geht: Wenn ich aufhöre, die Retterin zu sein, die Märtyrerin — wer bin ich dann?</w:t>
       </w:r>
     </w:p>
     <w:p>
@@ -6188,7 +6188,7 @@
         <w:pStyle w:val="Heading2"/>
       </w:pPr>
       <w:r>
-        <w:t>Die zweite Geschichte: wenn der Körper das weiss, was der Kopf verdrängt hat</w:t>
+        <w:t>Die zweite Geschichte: wenn der Körper das weiß, was der Kopf verdrängt hat</w:t>
       </w:r>
     </w:p>
     <w:p>
@@ -6842,7 +6842,7 @@
         <w:t>Öffentlich anders als privat.</w:t>
       </w:r>
       <w:r>
-        <w:t xml:space="preserve"> Nach aussen ist er charmant, beliebt, gut angesehen. Auf Partys hilft er, lacht, ist aufmerksam. Nur du siehst das andere Gesicht. Wenn du davon erzählst, glauben dir andere oft nicht. Das verstärkt deine Isolation: Du fühlst dich verrückt. Du fragst dich, ob du diejenige bist, die das Problem ist.</w:t>
+        <w:t xml:space="preserve"> Nach aussen ist er charmant, beliebt, gut angesehen. Auf Partys hilft er, lacht, ist aufmerksam. Nur du siehst das andere Gesicht. Wenn du davon erzählst, glauben dir andere oft nicht. Das verstärkt deine Isolation: Du fühlst dich verrückt. Du fragst dich, ob du derjenigen bist, die das Problem ist.</w:t>
       </w:r>
     </w:p>
     <w:p>
@@ -7672,7 +7672,7 @@
         <w:t>Beobachtung statt Bewertung.</w:t>
       </w:r>
       <w:r>
-        <w:t xml:space="preserve"> Nicht: „Du ignorierst mich immer." Das ist eine Bewertung, keine Beobachtung. Und sie löst sofort Widerstand aus. Stattdessen: „Gestern Abend hast du drei Stunden auf dein Handy geschaut, während wir zusammen waren."</w:t>
+        <w:t xml:space="preserve"> Nicht: „Du ignorierst mich immer." Das ist eine Bewertung, kein Beobachtung. Und sie löst sofort Widerstand aus. Stattdessen: „Gestern Abend hast du drei Stunden auf dein Handy geschaut, während wir zusammen waren."</w:t>
       </w:r>
     </w:p>
     <w:p>
@@ -8739,31 +8739,60 @@
         <w:ind w:firstLine="283"/>
       </w:pPr>
       <w:r>
-        <w:t>Autorin: Petra Tanner © 2025 Petra Tanner / Safe to Thrive</w:t>
-      </w:r>
-    </w:p>
-    <w:p>
-      <w:pPr>
-        <w:ind w:firstLine="283"/>
-      </w:pPr>
-      <w:r>
-        <w:t>Alle Rechte vorbehalten. Das Werk einschliesslich aller seiner Teile ist urheberrechtlich geschützt. Jede Verwertung ausserhalb der engen Grenzen des Urheberrechts ist ohne Zustimmung der Autorin unzulässig und strafbar.</w:t>
-      </w:r>
-    </w:p>
-    <w:p>
-      <w:pPr>
-        <w:ind w:firstLine="283"/>
-      </w:pPr>
-      <w:r>
-        <w:t>Die in diesem Buch enthaltenen Informationen ersetzen keine professionelle therapeutische oder medizinische Beratung. Bei ernsthaften psychischen Belastungen wird empfohlen, professionelle Unterstützung zu suchen.</w:t>
-      </w:r>
-    </w:p>
-    <w:p>
-      <w:pPr>
-        <w:ind w:firstLine="283"/>
-      </w:pPr>
-      <w:r>
-        <w:t>Alle im Buch erwähnten Fallbeispiele sind anonymisiert oder als Composite-Fälle dargestellt. Ähnlichkeiten mit realen Personen sind rein zufällig.</w:t>
+        <w:t>Autorin: Petra Tanner © 2026 Petra Tanner / Safe to Thrive Schweiz</w:t>
+      </w:r>
+    </w:p>
+    <w:p>
+      <w:pPr>
+        <w:ind w:firstLine="283"/>
+      </w:pPr>
+      <w:r>
+        <w:t>Alle Rechte vorbehalten. Das Werk einschliesslich aller seiner Teile ist urheberrechtlich geschützt. Jede Verwertung ausserhalb der engen Grenzen des Urheberrechtsgesetzes — insbesondere Vervielfältigung, Übersetzung, Mikroverfilmung sowie Einspeicherung und Verarbeitung in elektronischen Systemen — ist ohne ausdrückliche schriftliche Zustimmung der Autorin unzulässig.</w:t>
+      </w:r>
+    </w:p>
+    <w:p>
+      <w:pPr>
+        <w:ind w:firstLine="283"/>
+      </w:pPr>
+      <w:r/>
+      <w:r>
+        <w:rPr>
+          <w:b/>
+        </w:rPr>
+        <w:t>Haftungsausschluss:</w:t>
+      </w:r>
+      <w:r>
+        <w:t xml:space="preserve"> Die in diesem Buch enthaltenen Inhalte dienen ausschliesslich zu Informations- und Bildungszwecken. Sie ersetzen in keinem Fall professionelle therapeutische, psychologische oder medizinische Beratung, Diagnose oder Behandlung. Die Autorin übernimmt keine Haftung für Schäden, die direkt oder indirekt aus der Anwendung der in diesem Buch beschriebenen Inhalte entstehen. Bei ernsthaften psychischen Belastungen, Krisen oder Verdacht auf psychische Erkrankungen wird ausdrücklich empfohlen, qualifizierte professionelle Unterstützung zu suchen.</w:t>
+      </w:r>
+    </w:p>
+    <w:p>
+      <w:pPr>
+        <w:ind w:firstLine="283"/>
+      </w:pPr>
+      <w:r/>
+      <w:r>
+        <w:rPr>
+          <w:b/>
+        </w:rPr>
+        <w:t>Fallbeispiele:</w:t>
+      </w:r>
+      <w:r>
+        <w:t xml:space="preserve"> Alle im Buch erwähnten Personen und Fallbeispiele sind anonymisiert oder als zusammengesetzte Composite-Fälle aus mehreren Situationen dargestellt. Sie dienen der Veranschaulichung und entsprechen keiner einzelnen realen Person. Ähnlichkeiten mit lebenden oder verstorbenen Personen sind rein zufällig und unbeabsichtigt.</w:t>
+      </w:r>
+    </w:p>
+    <w:p>
+      <w:pPr>
+        <w:ind w:firstLine="283"/>
+      </w:pPr>
+      <w:r/>
+      <w:r>
+        <w:rPr>
+          <w:b/>
+        </w:rPr>
+        <w:t>Externe Links:</w:t>
+      </w:r>
+      <w:r>
+        <w:t xml:space="preserve"> Hinweise auf Websites Dritter (z. B. www.safetothrive.ch) liegen ausserhalb des Verantwortungsbereichs der Autorin. Für deren Inhalte übernimmt die Autorin keine Haftung.</w:t>
       </w:r>
     </w:p>
     <w:sectPr>

</xml_diff>

<commit_message>
Homepage-Link entfernt, E-Mail als Kontakt eingesetzt
- www.safetothrive.ch überall entfernt (Homepage existiert nicht)
- Kontakt neu: tanner.pe@bluewin.ch
- CTA-Sektion vereinfacht (Newsletter-Abschnitt gestrichen)
- Manuskript und DOCX neu gebaut

Co-Authored-By: Claude Sonnet 4.6 <noreply@anthropic.com>
Claude-Session: https://claude.ai/code/session_011oFtWvyjvkDdc6K2GcSXHx
</commit_message>
<xml_diff>
--- a/outputs/buch-beziehungen/wenn-beziehungen-erschoepfen-KDP.docx
+++ b/outputs/buch-beziehungen/wenn-beziehungen-erschoepfen-KDP.docx
@@ -8354,7 +8354,7 @@
         <w:t>Safe to Thrive</w:t>
       </w:r>
       <w:r>
-        <w:t xml:space="preserve"> Einzel-Coachings, Gruppenangebote und Onlineprogramme für Frauen an, die bereit sind, ihr Leben in die eigenen Hände zu nehmen.</w:t>
+        <w:t xml:space="preserve"> Einzel-Coachings und Gruppenangebote für Frauen an, die bereit sind, ihr Leben in die eigenen Hände zu nehmen.</w:t>
       </w:r>
     </w:p>
     <w:p>
@@ -8366,48 +8366,48 @@
       </w:r>
     </w:p>
     <w:p>
+      <w:r>
+        <w:br w:type="page"/>
+      </w:r>
+    </w:p>
+    <w:p>
+      <w:pPr>
+        <w:pStyle w:val="Heading1"/>
+      </w:pPr>
+      <w:r>
+        <w:t>Wenn du mehr möchtest</w:t>
+      </w:r>
+    </w:p>
+    <w:p>
+      <w:pPr>
+        <w:ind w:firstLine="283"/>
+      </w:pPr>
+      <w:r>
+        <w:t>Dieses Buch ist ein Anfang.</w:t>
+      </w:r>
+    </w:p>
+    <w:p>
+      <w:pPr>
+        <w:ind w:firstLine="283"/>
+      </w:pPr>
+      <w:r>
+        <w:t>Wenn du merkst, dass du tiefer gehen möchtest — dass du Begleitung suchst, konkrete Werkzeuge, eine Gemeinschaft von Frauen auf demselben Weg — dann gibt es Möglichkeiten, den nächsten Schritt zu gehen.</w:t>
+      </w:r>
+    </w:p>
+    <w:p>
       <w:pPr>
         <w:pStyle w:val="Heading2"/>
       </w:pPr>
       <w:r>
-        <w:t>Kontakt und weitere Informationen:</w:t>
-      </w:r>
-    </w:p>
-    <w:p>
-      <w:pPr>
-        <w:ind w:firstLine="283"/>
-      </w:pPr>
-      <w:r>
-        <w:t>Safe to Thrive — www.safetothrive.ch</w:t>
-      </w:r>
-    </w:p>
-    <w:p>
-      <w:r>
-        <w:br w:type="page"/>
-      </w:r>
-    </w:p>
-    <w:p>
-      <w:pPr>
-        <w:pStyle w:val="Heading1"/>
-      </w:pPr>
-      <w:r>
-        <w:t>Wenn du mehr möchtest</w:t>
-      </w:r>
-    </w:p>
-    <w:p>
-      <w:pPr>
-        <w:ind w:firstLine="283"/>
-      </w:pPr>
-      <w:r>
-        <w:t>Dieses Buch ist ein Anfang.</w:t>
-      </w:r>
-    </w:p>
-    <w:p>
-      <w:pPr>
-        <w:ind w:firstLine="283"/>
-      </w:pPr>
-      <w:r>
-        <w:t>Wenn du merkst, dass du tiefer gehen möchtest — dass du Begleitung suchst, konkrete Werkzeuge, eine Gemeinschaft von Frauen auf demselben Weg — dann gibt es Möglichkeiten, den nächsten Schritt zu gehen.</w:t>
+        <w:t>Safe to Thrive Einzelcoaching</w:t>
+      </w:r>
+    </w:p>
+    <w:p>
+      <w:pPr>
+        <w:ind w:firstLine="283"/>
+      </w:pPr>
+      <w:r>
+        <w:t>Für Frauen, die individuelle Begleitung suchen. Wir arbeiten gemeinsam an deinen spezifischen Mustern und Beziehungssituationen.</w:t>
       </w:r>
     </w:p>
     <w:p>
@@ -8415,22 +8415,6 @@
         <w:pStyle w:val="Heading2"/>
       </w:pPr>
       <w:r>
-        <w:t>Safe to Thrive Einzelcoaching</w:t>
-      </w:r>
-    </w:p>
-    <w:p>
-      <w:pPr>
-        <w:ind w:firstLine="283"/>
-      </w:pPr>
-      <w:r>
-        <w:t>Für Frauen, die individuelle Begleitung suchen. Wir arbeiten gemeinsam an deinen spezifischen Mustern und Beziehungssituationen.</w:t>
-      </w:r>
-    </w:p>
-    <w:p>
-      <w:pPr>
-        <w:pStyle w:val="Heading2"/>
-      </w:pPr>
-      <w:r>
         <w:t>Safe to Thrive Gruppenformat</w:t>
       </w:r>
     </w:p>
@@ -8444,42 +8428,26 @@
     </w:p>
     <w:p>
       <w:pPr>
-        <w:pStyle w:val="Heading2"/>
-      </w:pPr>
-      <w:r>
-        <w:t>Newsletter und Impulse</w:t>
-      </w:r>
-    </w:p>
-    <w:p>
-      <w:pPr>
-        <w:ind w:firstLine="283"/>
-      </w:pPr>
-      <w:r>
-        <w:t>Regelmässige Texte, Reflexionsfragen und Einblicke — direkt in dein Postfach.</w:t>
-      </w:r>
-    </w:p>
-    <w:p>
-      <w:pPr>
-        <w:ind w:firstLine="283"/>
-      </w:pPr>
-      <w:r>
-        <w:t xml:space="preserve">Mehr Informationen findest du unter: </w:t>
+        <w:ind w:firstLine="283"/>
+      </w:pPr>
+      <w:r>
+        <w:t>Du musst diesen Weg nicht alleine gehen.</w:t>
+      </w:r>
+    </w:p>
+    <w:p>
+      <w:pPr>
+        <w:ind w:firstLine="283"/>
+      </w:pPr>
+      <w:r>
+        <w:t xml:space="preserve">Bei Interesse melde dich direkt per E-Mail: </w:t>
       </w:r>
       <w:r>
         <w:rPr>
           <w:b/>
         </w:rPr>
-        <w:t>www.safetothrive.ch</w:t>
+        <w:t>tanner.pe@bluewin.ch</w:t>
       </w:r>
       <w:r/>
-    </w:p>
-    <w:p>
-      <w:pPr>
-        <w:ind w:firstLine="283"/>
-      </w:pPr>
-      <w:r>
-        <w:t>Du musst diesen Weg nicht alleine gehen.</w:t>
-      </w:r>
     </w:p>
     <w:p>
       <w:r>
@@ -8789,10 +8757,10 @@
         <w:rPr>
           <w:b/>
         </w:rPr>
-        <w:t>Externe Links:</w:t>
-      </w:r>
-      <w:r>
-        <w:t xml:space="preserve"> Hinweise auf Websites Dritter (z. B. www.safetothrive.ch) liegen ausserhalb des Verantwortungsbereichs der Autorin. Für deren Inhalte übernimmt die Autorin keine Haftung.</w:t>
+        <w:t>Kontakt:</w:t>
+      </w:r>
+      <w:r>
+        <w:t xml:space="preserve"> tanner.pe@bluewin.ch</w:t>
       </w:r>
     </w:p>
     <w:sectPr>

</xml_diff>

<commit_message>
Gedankenstriche reduziert: 220 → 49 (natürlicherer Lesestil)
Überflüssige em-dashes ersetzt durch Kommas, Doppelpunkte und neue Sätze.
Behalten: dramatische Pausen, Titel, rhythmisch begründete Stellen.
DOCX neu gebaut.

Co-Authored-By: Claude Sonnet 4.6 <noreply@anthropic.com>
Claude-Session: https://claude.ai/code/session_011oFtWvyjvkDdc6K2GcSXHx
</commit_message>
<xml_diff>
--- a/outputs/buch-beziehungen/wenn-beziehungen-erschoepfen-KDP.docx
+++ b/outputs/buch-beziehungen/wenn-beziehungen-erschoepfen-KDP.docx
@@ -402,7 +402,7 @@
         <w:ind w:firstLine="283"/>
       </w:pPr>
       <w:r>
-        <w:t>Du denkst an den Tag zurück. Du hast zugehört, gekocht, organisiert, getröstet, funktioniert. Du warst für alle da — für deinen Partner, deine Kinder, deine Freundin, deine Mutter, die Kollegin, die schon wieder nicht fertig wurde. Und irgendwann, fast nebenbei, hat jemand gefragt: „Wie war dein Tag?"</w:t>
+        <w:t>Du denkst an den Tag zurück. Du hast zugehört, gekocht, organisiert, getröstet, funktioniert. Du warst für alle da: für deinen Partner, deine Kinder, deine Freundin, deine Mutter, die Kollegin, die schon wieder nicht fertig wurde. Und irgendwann, fast nebenbei, hat jemand gefragt: „Wie war dein Tag?"</w:t>
       </w:r>
     </w:p>
     <w:p>
@@ -442,7 +442,7 @@
         <w:ind w:firstLine="283"/>
       </w:pPr>
       <w:r>
-        <w:t>Katharina war vierzig, als sie zum ersten Mal in meine Praxis kam. Ärztin, Mutter von zwei Kindern, seit zwölf Jahren verheiratet. Sie kam, weil sie nicht mehr schlafen konnte. Nicht wegen Stress, wie sie sagte — sondern wegen eines diffusen Gefühls, das sie nicht benennen konnte.</w:t>
+        <w:t>Katharina war vierzig, als sie zum ersten Mal in meine Praxis kam. Ärztin, Mutter von zwei Kindern, seit zwölf Jahren verheiratet. Sie kam, weil sie nicht mehr schlafen konnte. Nicht wegen Stress, wie sie sagte, sondern wegen eines diffusen Gefühls, das sie nicht benennen konnte.</w:t>
       </w:r>
     </w:p>
     <w:p>
@@ -463,7 +463,7 @@
         <w:ind w:firstLine="283"/>
       </w:pPr>
       <w:r>
-        <w:t>Ich fragte sie: „Wann haben Sie zuletzt an sich gedacht — nicht an Ihre Funktion, nicht an Ihre Pflichten, sondern wirklich an sich?"</w:t>
+        <w:t>Ich fragte sie: „Wann haben Sie zuletzt an sich gedacht, nicht an Ihre Funktion, nicht an Ihre Pflichten, sondern wirklich an sich?"</w:t>
       </w:r>
     </w:p>
     <w:p>
@@ -628,7 +628,7 @@
         <w:ind w:firstLine="283"/>
       </w:pPr>
       <w:r>
-        <w:t>Eine andere Frau, die ich begleitet habe — ich nenne sie Monika — beschrieb es so:</w:t>
+        <w:t>Eine andere Frau, die ich begleitet habe, ich nenne sie Monika, beschrieb es so:</w:t>
       </w:r>
     </w:p>
     <w:p>
@@ -776,7 +776,7 @@
           <w:i/>
           <w:sz w:val="21"/>
         </w:rPr>
-        <w:t>„Wann habe ich zuletzt wirklich an mich gedacht — nicht an meine Funktion, sondern an mich?"</w:t>
+        <w:t>„Wann habe ich zuletzt wirklich an mich gedacht, nicht an meine Funktion, sondern an mich?"</w:t>
       </w:r>
     </w:p>
     <w:p>
@@ -854,7 +854,7 @@
         <w:ind w:firstLine="283"/>
       </w:pPr>
       <w:r>
-        <w:t>Ursprünglich kam dieser Begriff aus der Suchtforschung. Man beobachtete, dass die Angehörigen von Suchtkranken oft selbst in einem Muster feststeckten: Sie organisierten ihr Leben um den Süchtigen herum, deckten ihn, retteten, kontrollierten — und verloren dabei sich selbst. Heute wissen wir, dass Co-Abhängigkeit weit über Suchtfamilien hinausgeht. Sie zeigt sich überall dort, wo ein Mensch seine eigene emotionale Stabilität daran knüpft, wie es dem anderen geht.</w:t>
+        <w:t>Ursprünglich kam dieser Begriff aus der Suchtforschung. Man beobachtete, dass die Angehörigen von Suchtkranken oft selbst in einem Muster feststeckten: Sie organisierten ihr Leben um den Süchtigen herum, deckten ihn, retteten, kontrollierten. Und verloren dabei sich selbst. Heute wissen wir, dass Co-Abhängigkeit weit über Suchtfamilien hinausgeht. Sie zeigt sich überall dort, wo ein Mensch seine eigene emotionale Stabilität daran knüpft, wie es dem anderen geht.</w:t>
       </w:r>
     </w:p>
     <w:p>
@@ -886,7 +886,7 @@
         <w:ind w:firstLine="283"/>
       </w:pPr>
       <w:r>
-        <w:t>Teresa reagierte auf die Stimmung ihres Mannes so, als wäre sie direkt mit ihr verbunden — als wäre seine Energie ihr eigenes Barometer. Das ist Co-Abhängigkeit. Nicht als Schwäche, sondern als gelerntes Muster.</w:t>
+        <w:t>Teresa reagierte auf die Stimmung ihres Mannes so, als wäre sie direkt mit ihr verbunden, als wäre seine Energie ihr eigenes Barometer. Das ist Co-Abhängigkeit. Nicht als Schwäche, sondern als gelerntes Muster.</w:t>
       </w:r>
     </w:p>
     <w:p>
@@ -911,7 +911,7 @@
         <w:ind w:firstLine="283"/>
       </w:pPr>
       <w:r>
-        <w:t>People-Pleasing ist das chronische Bedürfnis, es allen recht zu machen. Die Unfähigkeit, Nein zu sagen. Die automatische Anpassung der eigenen Wünsche an das, was andere erwarten — weil man Angst hat, abgelehnt oder verlassen zu werden.</w:t>
+        <w:t>People-Pleasing ist das chronische Bedürfnis, es allen recht zu machen. Die Unfähigkeit, Nein zu sagen. Die automatische Anpassung der eigenen Wünsche an das, was andere erwarten, weil man Angst hat, abgelehnt oder verlassen zu werden.</w:t>
       </w:r>
     </w:p>
     <w:p>
@@ -935,7 +935,7 @@
         <w:ind w:firstLine="283"/>
       </w:pPr>
       <w:r>
-        <w:t>Eine Klientin — ich nenne sie Sandra — beschrieb es so: „Ich bin die, bei der jeder anruft. Kollegen, Freundinnen, meine Schwester, meine Mutter. Ich gebe immer Rat, bin immer da, höre immer zu. Und dann, wenn ich selbst etwas brauche, traue ich mich nicht mal, darum zu bitten. Ich denke: Ich will doch nicht zur Last fallen. Ich bin doch die Starke. Die anderen haben echte Probleme."</w:t>
+        <w:t>Eine Klientin, ich nenne sie Sandra, beschrieb es so: „Ich bin die, bei der jeder anruft. Kollegen, Freundinnen, meine Schwester, meine Mutter. Ich gebe immer Rat, bin immer da, höre immer zu. Und dann, wenn ich selbst etwas brauche, traue ich mich nicht mal, darum zu bitten. Ich denke: Ich will doch nicht zur Last fallen. Ich bin doch die Starke. Die anderen haben echte Probleme."</w:t>
       </w:r>
     </w:p>
     <w:p>
@@ -968,7 +968,7 @@
         <w:ind w:firstLine="283"/>
       </w:pPr>
       <w:r>
-        <w:t>Viele Frauen mit diesen Mustern sind auch Perfektionistinnen. Nicht weil sie Dinge gerne schön machen wollen — sondern weil sie gelernt haben, dass Fehler Konsequenzen haben. Dass man geliebt wird, wenn man alles richtig macht. Dass Kritik eine Bedrohung ist.</w:t>
+        <w:t>Viele Frauen mit diesen Mustern sind auch Perfektionistinnen. Nicht weil sie Dinge gerne schön machen wollen, sondern weil sie gelernt haben, dass Fehler Konsequenzen haben. Dass man geliebt wird, wenn man alles richtig macht. Dass Kritik eine Bedrohung ist.</w:t>
       </w:r>
     </w:p>
     <w:p>
@@ -984,7 +984,7 @@
         <w:ind w:firstLine="283"/>
       </w:pPr>
       <w:r>
-        <w:t>Und weil Perfektion unerreichbar ist, bleibt ein dauerhaftes Gefühl des Nicht-Genügens — auch wenn andere ringsum beeindruckt sind von dem, was man leistet.</w:t>
+        <w:t>Und weil Perfektion unerreichbar ist, bleibt ein dauerhaftes Gefühl des Nicht-Genügens, auch wenn andere ringsum beeindruckt sind von dem, was man leistet.</w:t>
       </w:r>
     </w:p>
     <w:p>
@@ -1144,7 +1144,7 @@
         <w:ind w:firstLine="283"/>
       </w:pPr>
       <w:r>
-        <w:t>Sie zeigen sich überall. In Freundschaften, wo du immer diejenige bist, die zuhört — aber selten diejenige, der zugehört wird. In der Familie, wo du die Vermittlerin bist, die Organisatorin, die sich kümmert. Im Beruf, wo du Aufgaben übernimmst, die eigentlich nicht deine sind, weil du Angst hast, als schwierig zu gelten.</w:t>
+        <w:t>Sie zeigen sich überall. In Freundschaften, wo du immer diejenige bist, die zuhört, aber selten diejenige, der zugehört wird. In der Familie, wo du die Vermittlerin bist, die Organisatorin, die sich kümmert. Im Beruf, wo du Aufgaben übernimmst, die eigentlich nicht deine sind, weil du Angst hast, als schwierig zu gelten.</w:t>
       </w:r>
     </w:p>
     <w:p>
@@ -1199,7 +1199,7 @@
           <w:i/>
           <w:sz w:val="21"/>
         </w:rPr>
-        <w:t>„Wann hat es begonnen — in welchem Bereich meines Lebens zeigt es sich am stärksten?"</w:t>
+        <w:t>„Wann hat es begonnen? In welchem Bereich meines Lebens zeigt es sich am stärksten?"</w:t>
       </w:r>
     </w:p>
     <w:p>
@@ -1268,7 +1268,7 @@
         <w:ind w:firstLine="283"/>
       </w:pPr>
       <w:r>
-        <w:t>Sie heisst Franziska, ist jetzt zweiundvierzig. Als Kind hatte sie eine Mutter, die Stimmungsschwankungen hatte. Manche Abende war die Mutter warm, liebevoll, präsent. Andere Abende — und man wusste nie welche — war sie kalt, schweigend, nicht erreichbar.</w:t>
+        <w:t>Sie heisst Franziska, ist jetzt zweiundvierzig. Als Kind hatte sie eine Mutter, die Stimmungsschwankungen hatte. Manche Abende war die Mutter warm, liebevoll, präsent. Andere Abende, und man wusste nie welche, war sie kalt, schweigend, nicht erreichbar.</w:t>
       </w:r>
     </w:p>
     <w:p>
@@ -1329,15 +1329,15 @@
         <w:ind w:firstLine="283"/>
       </w:pPr>
       <w:r>
-        <w:t>Als Kinder sind wir auf unsere Bezugspersonen angewiesen — nicht nur für Nahrung und Schutz, sondern für etwas viel Grundlegenderes: die emotionale Rückmeldung, die uns sagt, wer wir sind. Unser Gehirn lernt, wie die Welt funktioniert, durch die Reaktionen der Menschen um uns herum. Es fragt konstant: Bin ich sicher? Bin ich willkommen? Bin ich genug?</w:t>
-      </w:r>
-    </w:p>
-    <w:p>
-      <w:pPr>
-        <w:ind w:firstLine="283"/>
-      </w:pPr>
-      <w:r>
-        <w:t>Wenn ein Kind immer wieder erlebt, dass Zuwendung an Bedingungen geknüpft ist — an Bravheit, an Anpassung, an das Nicht-Stören — dann internalisiert es eine Überzeugung, die tief sitzt und schwer zu erschüttern ist:</w:t>
+        <w:t>Als Kinder sind wir auf unsere Bezugspersonen angewiesen, nicht nur für Nahrung und Schutz, sondern für etwas viel Grundlegenderes: die emotionale Rückmeldung, die uns sagt, wer wir sind. Unser Gehirn lernt, wie die Welt funktioniert, durch die Reaktionen der Menschen um uns herum. Es fragt konstant: Bin ich sicher? Bin ich willkommen? Bin ich genug?</w:t>
+      </w:r>
+    </w:p>
+    <w:p>
+      <w:pPr>
+        <w:ind w:firstLine="283"/>
+      </w:pPr>
+      <w:r>
+        <w:t>Wenn ein Kind immer wieder erlebt, dass Zuwendung an Bedingungen geknüpft ist, an Bravheit, an Anpassung, an das Nicht-Stören, dann internalisiert es eine Überzeugung, die tief sitzt und schwer zu erschüttern ist:</w:t>
       </w:r>
     </w:p>
     <w:p>
@@ -1358,7 +1358,7 @@
         <w:ind w:firstLine="283"/>
       </w:pPr>
       <w:r>
-        <w:t>Die Bindungsforschung hat das sehr präzise beschrieben. John Bowlby, Mary Ainsworth und viele nach ihnen haben gezeigt, dass Kinder verschiedene Strategien entwickeln, um mit ihren Bezugspersonen umzugehen. Diese Strategien nennen wir Bindungsstile — und sie prägen uns weit ins Erwachsenenleben hinein.</w:t>
+        <w:t>Die Bindungsforschung hat das sehr präzise beschrieben. John Bowlby, Mary Ainsworth und viele nach ihnen haben gezeigt, dass Kinder verschiedene Strategien entwickeln, um mit ihren Bezugspersonen umzugehen. Diese Strategien nennen wir Bindungsstile, und sie prägen uns weit ins Erwachsenenleben hinein.</w:t>
       </w:r>
     </w:p>
     <w:p>
@@ -1375,7 +1375,7 @@
         <w:t>sicher gebundene</w:t>
       </w:r>
       <w:r>
-        <w:t xml:space="preserve"> Mensch hat erlebt: Wenn ich jemanden brauche, ist er da. Er kann weinen, wütend sein, Bedürfnisse zeigen — und wird trotzdem geliebt. Als Erwachsener geht er relativ entspannt mit Nähe und Distanz um. Er kann Zuwendung einfordern, ohne Angst vor Zurückweisung.</w:t>
+        <w:t xml:space="preserve"> Mensch hat erlebt: Wenn ich jemanden brauche, ist er da. Er kann weinen, wütend sein, Bedürfnisse zeigen, und wird trotzdem geliebt. Als Erwachsener geht er relativ entspannt mit Nähe und Distanz um. Er kann Zuwendung einfordern, ohne Angst vor Zurückweisung.</w:t>
       </w:r>
     </w:p>
     <w:p>
@@ -1392,7 +1392,7 @@
         <w:t>ängstlich-ambivalenten Bindungsstil</w:t>
       </w:r>
       <w:r>
-        <w:t>. Das Kind hatte eine Bezugsperson, die manchmal sehr liebevoll war und manchmal emotional abwesend — unberechenbar, in ihrer eigenen Welt. Das Kind lernt: Ich muss extra angepasst sein, damit ich Aufmerksamkeit bekomme. Als Erwachsener will man Nähe, traut ihr aber nicht. Man ist sehr fein abgestimmt auf die Stimmungen anderer. Man fragt sich ständig, ob man genug ist, ob man zu viel ist, ob man es richtig macht.</w:t>
+        <w:t>. Das Kind hatte eine Bezugsperson, die manchmal sehr liebevoll war und manchmal emotional abwesend, unberechenbar, in ihrer eigenen Welt. Das Kind lernt: Ich muss extra angepasst sein, damit ich Aufmerksamkeit bekomme. Als Erwachsener will man Nähe, traut ihr aber nicht. Man ist sehr fein abgestimmt auf die Stimmungen anderer. Man fragt sich ständig, ob man genug ist, ob man zu viel ist, ob man es richtig macht.</w:t>
       </w:r>
     </w:p>
     <w:p>
@@ -1417,7 +1417,7 @@
         <w:t>vermeidend-unsicheren Bindungsstil</w:t>
       </w:r>
       <w:r>
-        <w:t xml:space="preserve"> hatte das Kind eine Bezugsperson, die emotional wenig zugänglich war. Nicht unbedingt kalt — aber distanziert, rational, nicht wirklich verbunden. Das Kind lernt: Bedürfnisse zeigen bringt nichts. Ich mache es alleine. Als Erwachsener wirkt man selbstständig und kompetent. Aber Nähe zulassen ist schwer. Das Herz ist sehr gut geschützt.</w:t>
+        <w:t xml:space="preserve"> hatte das Kind eine Bezugsperson, die emotional wenig zugänglich war. Nicht unbedingt kalt, aber distanziert, rational, nicht wirklich verbunden. Das Kind lernt: Bedürfnisse zeigen bringt nichts. Ich mache es alleine. Als Erwachsener wirkt man selbstständig und kompetent. Aber Nähe zulassen ist schwer. Das Herz ist sehr gut geschützt.</w:t>
       </w:r>
     </w:p>
     <w:p>
@@ -1434,7 +1434,7 @@
         <w:t>desorganisierten Bindungsstil</w:t>
       </w:r>
       <w:r>
-        <w:t>, der entsteht, wenn die Bezugsperson gleichzeitig Quelle der Zuwendung und der Angst war. Das Kind weiss nicht: Soll ich näherkommen oder fliehen? Es gibt keine konsistente Strategie. Als Erwachsener fühlen sich Beziehungen chaotisch an — mal extreme Nähe, dann wieder Abstand. Vertrauen ist schwer.</w:t>
+        <w:t>, der entsteht, wenn die Bezugsperson gleichzeitig Quelle der Zuwendung und der Angst war. Das Kind weiss nicht: Soll ich näherkommen oder fliehen? Es gibt keine konsistente Strategie. Als Erwachsener fühlen sich Beziehungen chaotisch an: mal extreme Nähe, dann wieder Abstand. Vertrauen ist schwer.</w:t>
       </w:r>
     </w:p>
     <w:p>
@@ -1458,7 +1458,7 @@
         <w:ind w:firstLine="283"/>
       </w:pPr>
       <w:r>
-        <w:t>Wenn du dich immer wieder in Beziehungen findest, in denen du mehr gibst als du bekommst — das ist kein Zufall. Wir wählen das Vertraute. Nicht weil es uns gut tut, sondern weil es sich anfühlt wie zu Hause. Auch wenn zu Hause einmal nicht sicher war.</w:t>
+        <w:t>Wenn du dich immer wieder in Beziehungen findest, in denen du mehr gibst als du bekommst. Das ist kein Zufall. Wir wählen das Vertraute. Nicht weil es uns gut tut, sondern weil es sich anfühlt wie zu Hause. Auch wenn zu Hause einmal nicht sicher war.</w:t>
       </w:r>
     </w:p>
     <w:p>
@@ -1474,7 +1474,7 @@
         <w:ind w:firstLine="283"/>
       </w:pPr>
       <w:r>
-        <w:t>Eine Frau, die als Kind gelernt hat, dass Zuwendung unzuverlässig ist, wird als Erwachsene immer ein bisschen ängstlich sein — immer warten, wann die Wärme wieder entzogen wird. Und in dieser Erwartung wird sie überangepasst, übergibt, überkompensiert.</w:t>
+        <w:t>Eine Frau, die als Kind gelernt hat, dass Zuwendung unzuverlässig ist, wird als Erwachsene immer ein bisschen ängstlich sein, immer warten, wann die Wärme wieder entzogen wird. Und in dieser Erwartung wird sie überangepasst, übergibt, überkompensiert.</w:t>
       </w:r>
     </w:p>
     <w:p>
@@ -1522,7 +1522,7 @@
         <w:ind w:firstLine="283"/>
       </w:pPr>
       <w:r>
-        <w:t>Das war lange die Annahme. Wir wissen heute, dass das nicht stimmt. Das Gehirn ist plastisch. Neue Erfahrungen, bewusste Arbeit, das Erlernen neuer emotionaler Strategien — all das kann etwas verändern. Nicht über Nacht. Nicht ohne Anstrengung. Aber es passiert.</w:t>
+        <w:t>Das war lange die Annahme. Wir wissen heute, dass das nicht stimmt. Das Gehirn ist plastisch. Neue Erfahrungen, bewusste Arbeit, das Erlernen neuer emotionaler Strategien: All das kann etwas verändern. Nicht über Nacht. Nicht ohne Anstrengung. Aber es passiert.</w:t>
       </w:r>
     </w:p>
     <w:p>
@@ -1551,7 +1551,7 @@
           <w:i/>
           <w:sz w:val="21"/>
         </w:rPr>
-        <w:t>„Das erste Mal, als ich einen Abend bei Freunden war und nicht einmal gedacht habe, ob alle glücklich sind — das war komisch," sagte sie. „Aber auch sehr, sehr leicht."</w:t>
+        <w:t>„Das erste Mal, als ich einen Abend bei Freunden war und nicht einmal gedacht habe, ob alle glücklich sind, das war komisch," sagte sie. „Aber auch sehr, sehr leicht."</w:t>
       </w:r>
     </w:p>
     <w:p>
@@ -1776,23 +1776,23 @@
         <w:ind w:firstLine="283"/>
       </w:pPr>
       <w:r>
-        <w:t>Es ist das versteckteste Gefühl in dieser ganzen Geschichte — und gleichzeitig das Gefährlichste für Beziehungen. Ressentiment entsteht, wenn wir immer wieder geben und nie wirklich zurückbekommen. Wenn wir Bedürfnisse zurückstellen und sie nie erfüllt werden. Wenn wir Ja sagen, obwohl wir Nein meinen, und dann still wütend sind.</w:t>
-      </w:r>
-    </w:p>
-    <w:p>
-      <w:pPr>
-        <w:ind w:firstLine="283"/>
-      </w:pPr>
-      <w:r>
-        <w:t>Das Tückische: Es zeigt sich selten als direkte Wut. Es zeigt sich als Gleichgültigkeit. Als Sarkasmus bei Kleinigkeiten. Als das nagende Gefühl, der andere macht eh alles falsch. Als eine leise Verbitterung, die du selbst kaum bemerkst — bis sie gross genug ist, dass sie alles färbt.</w:t>
-      </w:r>
-    </w:p>
-    <w:p>
-      <w:pPr>
-        <w:ind w:firstLine="283"/>
-      </w:pPr>
-      <w:r>
-        <w:t>Eine Klientin — ich nenne sie Vreni — beschrieb es so: „Ich merkte, dass ich anfing, auf meinen Mann aufmerksam zu sein auf eine Art, die nicht schön war. Jedes kleine Ding, das er falsch machte, registrierte ich. Den Becher, der neben der Spüle stand. Die Jacke auf dem Stuhl. Normalerweise hätte ich das nicht mal gesehen. Aber es fing an, mich zu irritieren. Ich dachte: Bin ich jetzt so eine Frau, die ihren Mann wegen eines Bechers hasst?"</w:t>
+        <w:t>Es ist das versteckteste Gefühl in dieser ganzen Geschichte, und gleichzeitig das Gefährlichste für Beziehungen. Ressentiment entsteht, wenn wir immer wieder geben und nie wirklich zurückbekommen. Wenn wir Bedürfnisse zurückstellen und sie nie erfüllt werden. Wenn wir Ja sagen, obwohl wir Nein meinen, und dann still wütend sind.</w:t>
+      </w:r>
+    </w:p>
+    <w:p>
+      <w:pPr>
+        <w:ind w:firstLine="283"/>
+      </w:pPr>
+      <w:r>
+        <w:t>Das Tückische: Es zeigt sich selten als direkte Wut. Es zeigt sich als Gleichgültigkeit. Als Sarkasmus bei Kleinigkeiten. Als das nagende Gefühl, der andere macht eh alles falsch. Als eine leise Verbitterung, die du selbst kaum bemerkst, bis sie gross genug ist, dass sie alles färbt.</w:t>
+      </w:r>
+    </w:p>
+    <w:p>
+      <w:pPr>
+        <w:ind w:firstLine="283"/>
+      </w:pPr>
+      <w:r>
+        <w:t>Eine Klientin, ich nenne sie Vreni, beschrieb es so: „Ich merkte, dass ich anfing, auf meinen Mann aufmerksam zu sein auf eine Art, die nicht schön war. Jedes kleine Ding, das er falsch machte, registrierte ich. Den Becher, der neben der Spüle stand. Die Jacke auf dem Stuhl. Normalerweise hätte ich das nicht mal gesehen. Aber es fing an, mich zu irritieren. Ich dachte: Bin ich jetzt so eine Frau, die ihren Mann wegen eines Bechers hasst?"</w:t>
       </w:r>
     </w:p>
     <w:p>
@@ -1887,7 +1887,7 @@
         <w:ind w:firstLine="283"/>
       </w:pPr>
       <w:r>
-        <w:t>Das letzte beschrieb mir Elke, 47 Jahre alt. Sie hatte einen Urlaub alleine gebucht — das erste Mal in ihrem Leben. Fünf Tage Toskana, nur für sich. „Ich war am ersten Abend so verloren," sagte sie. „Ich sass im Restaurant und wusste nicht, was ich bestellen sollte. Weil ich sonst immer schaue, was alle anderen wollen, und dann irgendetwas nehme, das passt. Ich hatte keinen Plan mehr, was ich selbst mag."</w:t>
+        <w:t>Das letzte beschrieb mir Elke, 47 Jahre alt. Sie hatte einen Urlaub alleine gebucht, das erste Mal in ihrem Leben. Fünf Tage Toskana, nur für sich. „Ich war am ersten Abend so verloren," sagte sie. „Ich sass im Restaurant und wusste nicht, was ich bestellen sollte. Weil ich sonst immer schaue, was alle anderen wollen, und dann irgendetwas nehme, das passt. Ich hatte keinen Plan mehr, was ich selbst mag."</w:t>
       </w:r>
     </w:p>
     <w:p>
@@ -1980,7 +1980,7 @@
         <w:ind w:firstLine="283"/>
       </w:pPr>
       <w:r>
-        <w:t>Und jetzt das Gegenbild. Wenn du beginnst, dich zu verändern — wenn du lernst, dich selbst als gleichwertig zu behandeln, echte Grenzen zu setzen, dich zu zeigen — was wäre dann möglich?</w:t>
+        <w:t>Und jetzt das Gegenbild. Wenn du beginnst, dich zu verändern, wenn du lernst, dich selbst als gleichwertig zu behandeln, echte Grenzen zu setzen, dich zu zeigen: Was wäre dann möglich?</w:t>
       </w:r>
     </w:p>
     <w:p>
@@ -2017,7 +2017,7 @@
           <w:i/>
           <w:sz w:val="21"/>
         </w:rPr>
-        <w:t>„Was zahle ich in meinen Beziehungen — mit welcher Währung?"</w:t>
+        <w:t>„Was zahle ich in meinen Beziehungen: mit welcher Währung?"</w:t>
       </w:r>
     </w:p>
     <w:p>
@@ -2030,7 +2030,7 @@
           <w:i/>
           <w:sz w:val="21"/>
         </w:rPr>
-        <w:t>„Wo spüre ich die Erschöpfung zuerst — im Körper, in der Emotion, in der Freude?"</w:t>
+        <w:t>„Wo spüre ich die Erschöpfung zuerst: im Körper, in der Emotion, in der Freude?"</w:t>
       </w:r>
     </w:p>
     <w:p>
@@ -2043,7 +2043,7 @@
           <w:i/>
           <w:sz w:val="21"/>
         </w:rPr>
-        <w:t>„Was wäre das Leben, das ich haben möchte — in fünf Jahren, in zehn Jahren?"</w:t>
+        <w:t>„Was wäre das Leben, das ich haben möchte: in fünf Jahren, in zehn Jahren?"</w:t>
       </w:r>
     </w:p>
     <w:p>
@@ -2064,7 +2064,7 @@
         <w:ind w:firstLine="283"/>
       </w:pPr>
       <w:r>
-        <w:t>Hast du jemals das Gefühl gehabt, eine Rolle zu spielen — ohne je entschieden zu haben, sie anzunehmen?</w:t>
+        <w:t>Hast du jemals das Gefühl gehabt, eine Rolle zu spielen, ohne je entschieden zu haben, sie anzunehmen?</w:t>
       </w:r>
     </w:p>
     <w:p>
@@ -2170,7 +2170,7 @@
         <w:ind w:firstLine="283"/>
       </w:pPr>
       <w:r>
-        <w:t>Das ist die Retterin. Meisterhaft darin, die Bedürfnisse anderer zu sehen — blind für die eigenen.</w:t>
+        <w:t>Das ist die Retterin. Meisterhaft darin, die Bedürfnisse anderer zu sehen, blind für die eigenen.</w:t>
       </w:r>
     </w:p>
     <w:p>
@@ -2194,7 +2194,7 @@
         <w:ind w:firstLine="283"/>
       </w:pPr>
       <w:r>
-        <w:t>Die Märtyrerin opfert sich. Sie stellt sich hinten an. Sie verzichtet, trägt, schleppt — und macht dabei ein Gesicht, das keinen Widerspruch duldet. Sie sagt vielleicht nicht laut: „Ich opfere mich für euch." Aber sie vermittelt es. Durch die Art, wie sie seufzt. Durch die Erschöpfung, die sichtbar wird. Durch den Satz: „Kein Problem, ich mach das schon."</w:t>
+        <w:t>Die Märtyrerin opfert sich. Sie stellt sich hinten an. Sie verzichtet, trägt, schleppt, und macht dabei ein Gesicht, das keinen Widerspruch duldet. Sie sagt vielleicht nicht laut: „Ich opfere mich für euch." Aber sie vermittelt es. Durch die Art, wie sie seufzt. Durch die Erschöpfung, die sichtbar wird. Durch den Satz: „Kein Problem, ich mach das schon."</w:t>
       </w:r>
     </w:p>
     <w:p>
@@ -2210,15 +2210,15 @@
         <w:ind w:firstLine="283"/>
       </w:pPr>
       <w:r>
-        <w:t>Und im Stillen hofft sie, dass ihr Opfer gesehen wird — dass man zurückgibt, was sie gibt. Wenn das nicht passiert, entsteht Bitterkeit. Eine leise, wachsende, vergiftende Bitterkeit.</w:t>
-      </w:r>
-    </w:p>
-    <w:p>
-      <w:pPr>
-        <w:ind w:firstLine="283"/>
-      </w:pPr>
-      <w:r>
-        <w:t>Ich habe in meiner Praxis eine Frau begleitet — ich nenne sie Ruth, siebenundfünfzig Jahre alt, Hausfrau, Mutter von vier Kindern. Ruth hatte vierzig Jahre lang für ihre Familie gelebt. Hatte nie gefragt, was sie wollte. Hatte ihre eigene Ausbildung abgebrochen, als ihr Mann beruflich weiterkam.</w:t>
+        <w:t>Und im Stillen hofft sie, dass ihr Opfer gesehen wird, dass man zurückgibt, was sie gibt. Wenn das nicht passiert, entsteht Bitterkeit. Eine leise, wachsende, vergiftende Bitterkeit.</w:t>
+      </w:r>
+    </w:p>
+    <w:p>
+      <w:pPr>
+        <w:ind w:firstLine="283"/>
+      </w:pPr>
+      <w:r>
+        <w:t>Ich habe in meiner Praxis eine Frau begleitet: Ruth, siebenundfünfzig Jahre alt, Hausfrau, Mutter von vier Kindern. Ruth hatte vierzig Jahre lang für ihre Familie gelebt. Hatte nie gefragt, was sie wollte. Hatte ihre eigene Ausbildung abgebrochen, als ihr Mann beruflich weiterkam.</w:t>
       </w:r>
     </w:p>
     <w:p>
@@ -2247,7 +2247,7 @@
         <w:ind w:firstLine="283"/>
       </w:pPr>
       <w:r>
-        <w:t>Das ist der Preis der Märtyrerin. Ein Leben gelebt für andere. Und am Ende: eine Leere, die niemand füllen kann — weil sie sich selbst nie den Platz gegeben hat.</w:t>
+        <w:t>Das ist der Preis der Märtyrerin. Ein Leben gelebt für andere. Und am Ende: eine Leere, die niemand füllen kann, weil sie sich selbst nie den Platz gegeben hat.</w:t>
       </w:r>
     </w:p>
     <w:p>
@@ -2271,7 +2271,7 @@
         <w:ind w:firstLine="283"/>
       </w:pPr>
       <w:r>
-        <w:t>Als Erwachsene ist das unsichtbare Kind oft sehr angenehm im Umgang. Verträglich, flexibel, konfliktscheu. Sie hat Meinungen, aber äussert sie selten. Sie hat Wünsche, aber formuliert sie kaum. Sie ist da — aber irgendwie auch nicht wirklich. Sie nimmt Raum ein, aber so wenig wie möglich.</w:t>
+        <w:t>Als Erwachsene ist das unsichtbare Kind oft sehr angenehm im Umgang. Verträglich, flexibel, konfliktscheu. Sie hat Meinungen, aber äussert sie selten. Sie hat Wünsche, aber formuliert sie kaum. Sie ist da, aber irgendwie auch nicht wirklich. Sie nimmt Raum ein, aber so wenig wie möglich.</w:t>
       </w:r>
     </w:p>
     <w:p>
@@ -2348,15 +2348,15 @@
         <w:ind w:firstLine="283"/>
       </w:pPr>
       <w:r>
-        <w:t>Rollen entstehen aus dem Bedürfnis nach Sicherheit. Als Kinder nehmen wir die Rolle an, die uns in unserem System am sichersten erscheint. In einer Familie mit emotional überforderten Eltern lernt ein Kind, unsichtbar zu sein — weil das sicherer ist als Aufmerksamkeit zu erregen. Wo viel erwartet wird, wird ein Kind zur Retterin. Wo Selbstlosigkeit als höchste Tugend gilt, wird ein Kind zur Märtyrerin.</w:t>
-      </w:r>
-    </w:p>
-    <w:p>
-      <w:pPr>
-        <w:ind w:firstLine="283"/>
-      </w:pPr>
-      <w:r>
-        <w:t>Diese Rollen bleiben, weil sie funktionieren. Als Erwachsene suchen wir dann instinktiv Beziehungen, in denen unsere Rolle gebraucht wird. Das fühlt sich vertraut an. Und das Vertraute fühlt sich — auch wenn es uns nicht gut tut — nach Hause an.</w:t>
+        <w:t>Rollen entstehen aus dem Bedürfnis nach Sicherheit. Als Kinder nehmen wir die Rolle an, die uns in unserem System am sichersten erscheint. In einer Familie mit emotional überforderten Eltern lernt ein Kind, unsichtbar zu sein, weil das sicherer ist als Aufmerksamkeit zu erregen. Wo viel erwartet wird, wird ein Kind zur Retterin. Wo Selbstlosigkeit als höchste Tugend gilt, wird ein Kind zur Märtyrerin.</w:t>
+      </w:r>
+    </w:p>
+    <w:p>
+      <w:pPr>
+        <w:ind w:firstLine="283"/>
+      </w:pPr>
+      <w:r>
+        <w:t>Diese Rollen bleiben, weil sie funktionieren. Als Erwachsene suchen wir dann instinktiv Beziehungen, in denen unsere Rolle gebraucht wird. Das fühlt sich vertraut an. Und das Vertraute fühlt sich, auch wenn es uns nicht gut tut, nach Hause an.</w:t>
       </w:r>
     </w:p>
     <w:p>
@@ -2459,7 +2459,7 @@
           <w:i/>
           <w:sz w:val="21"/>
         </w:rPr>
-        <w:t>„Welche Beziehungen in meinem Leben brauchen diese Rolle von mir — und würden sie mich auch ohne sie mögen?"</w:t>
+        <w:t>„Welche Beziehungen in meinem Leben brauchen diese Rolle von mir, und würden sie mich auch ohne sie mögen?"</w:t>
       </w:r>
     </w:p>
     <w:p>
@@ -2636,7 +2636,7 @@
         <w:ind w:firstLine="283"/>
       </w:pPr>
       <w:r>
-        <w:t>Du gibst mehr. Der andere nimmt — nicht aus Bosheit, sondern weil du es möglich machst. Du wirst erschöpfter. Du wirst enttäuschter. Du gibst trotzdem weiter, weil du hoffst, dass es diesmal funktioniert.</w:t>
+        <w:t>Du gibst mehr. Der andere nimmt, nicht aus Bosheit, sondern weil du es möglich machst. Du wirst erschöpfter. Du wirst enttäuschter. Du gibst trotzdem weiter, weil du hoffst, dass es diesmal funktioniert.</w:t>
       </w:r>
     </w:p>
     <w:p>
@@ -2764,7 +2764,7 @@
         <w:ind w:firstLine="283"/>
       </w:pPr>
       <w:r>
-        <w:t>Wenn wir immer mehr geben, steckt da unten eine ganz bestimmte Berechnung. Eine, die wir selten aussprechen — manchmal nicht mal uns selbst gegenüber. Sie klingt ungefähr so:</w:t>
+        <w:t>Wenn wir immer mehr geben, steckt da unten eine ganz bestimmte Berechnung. Eine, die wir selten aussprechen, manchmal nicht mal uns selbst gegenüber. Sie klingt ungefähr so:</w:t>
       </w:r>
     </w:p>
     <w:p>
@@ -2819,7 +2819,7 @@
         <w:ind w:firstLine="283"/>
       </w:pPr>
       <w:r>
-        <w:t>Eine Klientin — ich nenne sie Petra, zweiundfünfzig Jahre alt — sagte mir nach langen Wochen gemeinsamer Arbeit: „Ich habe gemerkt, dass ich nie geglaubt habe, dass mich jemand liebt, wenn ich nichts tue. Ich dachte, Liebe muss man sich verdienen. Wie einen Job. Mit Leistung, Zuverlässigkeit, guten Ergebnissen. Wenn man versagt, verliert man die Stelle."</w:t>
+        <w:t>Eine Klientin, ich nenne sie Petra, zweiundfünfzig Jahre alt, sagte mir nach langen Wochen gemeinsamer Arbeit: „Ich habe gemerkt, dass ich nie geglaubt habe, dass mich jemand liebt, wenn ich nichts tue. Ich dachte, Liebe muss man sich verdienen. Wie einen Job. Mit Leistung, Zuverlässigkeit, guten Ergebnissen. Wenn man versagt, verliert man die Stelle."</w:t>
       </w:r>
     </w:p>
     <w:p>
@@ -2880,7 +2880,7 @@
         <w:ind w:firstLine="283"/>
       </w:pPr>
       <w:r>
-        <w:t>Diese Frage öffnet etwas. Weil die meiste Überanpassung aus Angst entsteht — der Angst, nicht zu genügen, verlassen zu werden, Liebe zu verlieren. Wenn du dir vorstellst, die Liebe wäre gesichert, unabhängig von dem, was du tust — was würdest du dann anders machen?</w:t>
+        <w:t>Diese Frage öffnet etwas. Weil die meiste Überanpassung aus Angst entsteht: der Angst, nicht zu genügen, verlassen zu werden, Liebe zu verlieren. Wenn du dir vorstellst, die Liebe wäre gesichert, unabhängig von dem, was du tust, was würdest du dann anders machen?</w:t>
       </w:r>
     </w:p>
     <w:p>
@@ -2996,7 +2996,7 @@
           <w:i/>
           <w:sz w:val="21"/>
         </w:rPr>
-        <w:t>„Wann habe ich zuletzt wirklich etwas bekommen — und nicht nur gegeben?"</w:t>
+        <w:t>„Wann habe ich zuletzt wirklich etwas bekommen, und nicht nur gegeben?"</w:t>
       </w:r>
     </w:p>
     <w:p>
@@ -3065,7 +3065,7 @@
         <w:ind w:firstLine="283"/>
       </w:pPr>
       <w:r>
-        <w:t>Grenzen sagen nicht: Ich will niemanden mehr in mein Leben lassen. Grenzen sagen: Ich entscheide, was in mein Leben passt und was nicht. Ich entscheide, wie ich behandelt werden möchte. Ich entscheide, was ich bereit bin zu geben — und was nicht.</w:t>
+        <w:t>Grenzen sagen nicht: Ich will niemanden mehr in mein Leben lassen. Grenzen sagen: Ich entscheide, was in mein Leben passt und was nicht. Ich entscheide, wie ich behandelt werden möchte. Ich entscheide, was ich bereit bin zu geben, und was nicht.</w:t>
       </w:r>
     </w:p>
     <w:p>
@@ -3081,7 +3081,7 @@
         <w:ind w:firstLine="283"/>
       </w:pPr>
       <w:r>
-        <w:t>Und hier ist etwas, das viele überrascht: Grenzen sind ein Geschenk an die Beziehung. Nicht nur an dich. An die Beziehung. Weil echte Nähe nur zwischen zwei Menschen entsteht, die ehrlich sind. Ohne Grenzen gibt es keine Ehrlichkeit. Ohne Ehrlichkeit gibt es keine echte Nähe — nur Anpassung. Und Anpassung ist keine Verbindung.</w:t>
+        <w:t>Und hier ist etwas, das viele überrascht: Grenzen sind ein Geschenk an die Beziehung. Nicht nur an dich. An die Beziehung. Weil echte Nähe nur zwischen zwei Menschen entsteht, die ehrlich sind. Ohne Grenzen gibt es keine Ehrlichkeit. Ohne Ehrlichkeit gibt es keine echte Nähe, nur Anpassung. Und Anpassung ist keine Verbindung.</w:t>
       </w:r>
     </w:p>
     <w:p>
@@ -3097,7 +3097,7 @@
         <w:ind w:firstLine="283"/>
       </w:pPr>
       <w:r>
-        <w:t>Mia hatte ihrem Mann gegenüber nie Nein gesagt. Nicht weil er ein schlechter Mensch war — sondern weil sie es nicht konnte. Jede Bitte ihres Mannes wurde erfüllt, auch wenn sie müde war, auch wenn sie selbst etwas brauchte, auch wenn ihr ganzer Körper Nein schrie.</w:t>
+        <w:t>Mia hatte ihrem Mann gegenüber nie Nein gesagt. Nicht weil er ein schlechter Mensch war, sondern weil sie es nicht konnte. Jede Bitte ihres Mannes wurde erfüllt, auch wenn sie müde war, auch wenn sie selbst etwas brauchte, auch wenn ihr ganzer Körper Nein schrie.</w:t>
       </w:r>
     </w:p>
     <w:p>
@@ -3142,7 +3142,7 @@
         <w:ind w:firstLine="283"/>
       </w:pPr>
       <w:r>
-        <w:t>Als Mia anfing, Grenzen zu setzen — kleine zuerst, dann grössere — war ihr Mann anfangs irritiert. Aber er passte sich an. Er begann, öfter zu fragen. Begann, mehr zu übernehmen. Die Beziehung wurde nicht schlechter. Sie wurde echter.</w:t>
+        <w:t>Als Mia anfing, Grenzen zu setzen, kleine zuerst, dann grössere, war ihr Mann anfangs irritiert. Aber er passte sich an. Er begann, öfter zu fragen. Begann, mehr zu übernehmen. Die Beziehung wurde nicht schlechter. Sie wurde echter.</w:t>
       </w:r>
     </w:p>
     <w:p>
@@ -3186,7 +3186,7 @@
         <w:t>Körperliche Grenzen.</w:t>
       </w:r>
       <w:r>
-        <w:t xml:space="preserve"> Dein Körper gehört dir. Immer und ohne Ausnahme. Das klingt selbstverständlich. Für viele Frauen ist es das nicht. Sie haben gelernt, körperliches Unbehagen zu übergehen. Berührungen zu tolerieren, die sie nicht wollen. Körperliche Signale ihres eigenen Systems zu ignorieren — den Bauchschmerz vor einem Treffen, die Verspannung nach einem Gespräch, die Erschöpfung, die kein Schlaf behebt.</w:t>
+        <w:t xml:space="preserve"> Dein Körper gehört dir. Immer und ohne Ausnahme. Das klingt selbstverständlich. Für viele Frauen ist es das nicht. Sie haben gelernt, körperliches Unbehagen zu übergehen. Berührungen zu tolerieren, die sie nicht wollen. Körperliche Signale ihres eigenen Systems zu ignorieren: den Bauchschmerz vor einem Treffen, die Verspannung nach einem Gespräch, die Erschöpfung, die kein Schlaf behebt.</w:t>
       </w:r>
     </w:p>
     <w:p>
@@ -3256,7 +3256,7 @@
         <w:t>Zeitliche Grenzen.</w:t>
       </w:r>
       <w:r>
-        <w:t xml:space="preserve"> Deine Zeit ist endlich. Was du mit ihr machst, ist eine Entscheidung — auch wenn es sich nicht so anfühlt. Wenn du jedem sagst, der fragt: „Ja, ich helfe dir", dann entscheidest du dich, deine Zeit für andere zu verwenden. Das kann wunderschön sein. Manchmal. Aber wenn du immer Ja sagst und keine Zeit für dich selbst übrig bleibt, dann ist das keine Hilfsbereitschaft mehr. Das ist die Unfähigkeit, Nein zu sagen.</w:t>
+        <w:t xml:space="preserve"> Deine Zeit ist endlich. Was du mit ihr machst, ist eine Entscheidung, auch wenn es sich nicht so anfühlt. Wenn du jedem sagst, der fragt: „Ja, ich helfe dir", dann entscheidest du dich, deine Zeit für andere zu verwenden. Das kann wunderschön sein. Manchmal. Aber wenn du immer Ja sagst und keine Zeit für dich selbst übrig bleibt, dann ist das keine Hilfsbereitschaft mehr. Das ist die Unfähigkeit, Nein zu sagen.</w:t>
       </w:r>
     </w:p>
     <w:p>
@@ -3288,7 +3288,7 @@
         <w:ind w:firstLine="283"/>
       </w:pPr>
       <w:r>
-        <w:t>Bevor du eine Grenze setzen kannst, musst du merken, wann sie überschritten wird. Dein Körper weiss das oft früher als dein Kopf. Eine Verspannung im Nacken. Ein Ziehen im Bauch. Das Gefühl, sich innerlich zusammenzuziehen. Das ist das Nein, das du überhört hast. Fang an, es zu hören — ohne sofort zu handeln. Nur wahrnehmen.</w:t>
+        <w:t>Bevor du eine Grenze setzen kannst, musst du merken, wann sie überschritten wird. Dein Körper weiss das oft früher als dein Kopf. Eine Verspannung im Nacken. Ein Ziehen im Bauch. Das Gefühl, sich innerlich zusammenzuziehen. Das ist das Nein, das du überhört hast. Fang an, es zu hören, ohne sofort zu handeln. Nur wahrnehmen.</w:t>
       </w:r>
     </w:p>
     <w:p>
@@ -3352,7 +3352,7 @@
         <w:ind w:firstLine="283"/>
       </w:pPr>
       <w:r>
-        <w:t>Es fühlt sich am Anfang viel zu direkt an. Es ist nicht zu direkt. Es ist klar. Und Klarheit ist eine Form von Respekt — für dich und für den anderen.</w:t>
+        <w:t>Es fühlt sich am Anfang viel zu direkt an. Es ist nicht zu direkt. Es ist klar. Und Klarheit ist eine Form von Respekt: für dich und für den anderen.</w:t>
       </w:r>
     </w:p>
     <w:p>
@@ -3400,7 +3400,7 @@
         <w:ind w:firstLine="283"/>
       </w:pPr>
       <w:r>
-        <w:t>Manche werden versuchen, dich zurück in das alte Muster zu drängen. Mit Schuldgefühlen, mit Vorwürfen, mit der Frage: „Was ist nur mit dir los?" Das zeigt dir etwas — nicht über deine Grenze, sondern über die Beziehung.</w:t>
+        <w:t>Manche werden versuchen, dich zurück in das alte Muster zu drängen. Mit Schuldgefühlen, mit Vorwürfen, mit der Frage: „Was ist nur mit dir los?" Das zeigt dir etwas: nicht über deine Grenze, sondern über die Beziehung.</w:t>
       </w:r>
     </w:p>
     <w:p>
@@ -3416,7 +3416,7 @@
         <w:ind w:firstLine="283"/>
       </w:pPr>
       <w:r>
-        <w:t>Menschen, die dich wirklich lieben, werden dein Nein akzeptieren — auch wenn sie kurz enttäuscht sind. Wer nur wegen deiner Funktion da war, wird gehen. Das wird wehtun. Und es wird dich befreien.</w:t>
+        <w:t>Menschen, die dich wirklich lieben, werden dein Nein akzeptieren, auch wenn sie kurz enttäuscht sind. Wer nur wegen deiner Funktion da war, wird gehen. Das wird wehtun. Und es wird dich befreien.</w:t>
       </w:r>
     </w:p>
     <w:p>
@@ -3585,7 +3585,7 @@
         <w:ind w:firstLine="283"/>
       </w:pPr>
       <w:r>
-        <w:t>Doch. Das ist dasselbe. Du bist auch jemand, für den Fürsorge möglich ist. Du bist auch eine Person, die Liebe verdient — nicht nur als Gebende, sondern als Empfangende.</w:t>
+        <w:t>Doch. Das ist dasselbe. Du bist auch jemand, für den Fürsorge möglich ist. Du bist auch eine Person, die Liebe verdient, nicht nur als Gebende, sondern als Empfangende.</w:t>
       </w:r>
     </w:p>
     <w:p>
@@ -3632,7 +3632,7 @@
         <w:t>Liebe ist nicht Selbstaufopferung.</w:t>
       </w:r>
       <w:r>
-        <w:t xml:space="preserve"> Es gibt einen Unterschied zwischen Fürsorge und Selbstaufgabe — und dieser Unterschied ist entscheidend.</w:t>
+        <w:t xml:space="preserve"> Es gibt einen Unterschied zwischen Fürsorge und Selbstaufgabe, und dieser Unterschied ist entscheidend.</w:t>
       </w:r>
     </w:p>
     <w:p>
@@ -3687,15 +3687,15 @@
         <w:t>Liebe ist nicht, sich verdienen zu müssen.</w:t>
       </w:r>
       <w:r>
-        <w:t xml:space="preserve"> Wenn du das Gefühl hast, ständig etwas leisten zu müssen, damit du geliebt wirst — wenn du Angst hast, dass die Liebe weggeht, sobald du aufhörst zu funktionieren — dann ist das keine Liebesbeziehung. Das ist ein Handel.</w:t>
-      </w:r>
-    </w:p>
-    <w:p>
-      <w:pPr>
-        <w:ind w:firstLine="283"/>
-      </w:pPr>
-      <w:r>
-        <w:t>Und Handel zwischen zwei Menschen ist auf Dauer erschöpfend und entwürdigend für beide. Der eine zahlt mit Erschöpfung. Der andere zahlt damit, nie wirklich gesehen zu haben, wen er liebt — weil die andere Person sich nie wirklich gezeigt hat.</w:t>
+        <w:t xml:space="preserve"> Wenn du das Gefühl hast, ständig etwas leisten zu müssen, damit du geliebt wirst, wenn du Angst hast, dass die Liebe weggeht, sobald du aufhörst zu funktionieren: Dann ist das keine Liebesbeziehung. Das ist ein Handel.</w:t>
+      </w:r>
+    </w:p>
+    <w:p>
+      <w:pPr>
+        <w:ind w:firstLine="283"/>
+      </w:pPr>
+      <w:r>
+        <w:t>Und Handel zwischen zwei Menschen ist auf Dauer erschöpfend und entwürdigend für beide. Der eine zahlt mit Erschöpfung. Der andere zahlt damit, nie wirklich gesehen zu haben, wen er liebt, weil die andere Person sich nie wirklich gezeigt hat.</w:t>
       </w:r>
     </w:p>
     <w:p>
@@ -3710,7 +3710,7 @@
         <w:t>Liebe ist nicht Kontrolle.</w:t>
       </w:r>
       <w:r>
-        <w:t xml:space="preserve"> Manchmal tarnt sich Kontrolle als Liebe. „Ich sage das nur, weil mir etwas an dir liegt." „Wenn du mich liebst, würdest du..." „Ich mache mir solche Sorgen um dich" — als Begründung dafür, Entscheidungen für dich zu treffen.</w:t>
+        <w:t xml:space="preserve"> Manchmal tarnt sich Kontrolle als Liebe. „Ich sage das nur, weil mir etwas an dir liegt." „Wenn du mich liebst, würdest du..." „Ich mache mir solche Sorgen um dich", als Begründung dafür, Entscheidungen für dich zu treffen.</w:t>
       </w:r>
     </w:p>
     <w:p>
@@ -3757,15 +3757,15 @@
         <w:t>Echte Liebe sieht dich.</w:t>
       </w:r>
       <w:r>
-        <w:t xml:space="preserve"> Nicht die Version von dir, die alle brauchen. Nicht die Funktion, die du erfüllst. Sondern dich. Mit deinen Ecken und Kanten, deinen Bedürfnissen, deinen Schwächen, deinen Wünschen. Echte Liebe fragt „Wie geht es dir wirklich?" — und wartet auf die ehrliche Antwort.</w:t>
-      </w:r>
-    </w:p>
-    <w:p>
-      <w:pPr>
-        <w:ind w:firstLine="283"/>
-      </w:pPr>
-      <w:r>
-        <w:t>Ich denke an Eva, dreiunddreissig Jahre alt. Eva hatte nach Jahren in einer erschöpfenden Beziehung eine neue Partnerschaft begonnen. Eines Abends kam sie zu mir und sagte, fast ungläubig: „Er hat gefragt, was ich mir für den Abend wünsche. Nicht: Was wollen wir essen — sondern was ich mir wünsche. Und dann hat er es gemacht."</w:t>
+        <w:t xml:space="preserve"> Nicht die Version von dir, die alle brauchen. Nicht die Funktion, die du erfüllst. Sondern dich. Mit deinen Ecken und Kanten, deinen Bedürfnissen, deinen Schwächen, deinen Wünschen. Echte Liebe fragt „Wie geht es dir wirklich?", und wartet auf die ehrliche Antwort.</w:t>
+      </w:r>
+    </w:p>
+    <w:p>
+      <w:pPr>
+        <w:ind w:firstLine="283"/>
+      </w:pPr>
+      <w:r>
+        <w:t>Ich denke an Eva, dreiunddreissig Jahre alt. Eva hatte nach Jahren in einer erschöpfenden Beziehung eine neue Partnerschaft begonnen. Eines Abends kam sie zu mir und sagte, fast ungläubig: „Er hat gefragt, was ich mir für den Abend wünsche. Nicht: Was wollen wir essen, sondern was ich mir wünsche. Und dann hat er es gemacht."</w:t>
       </w:r>
     </w:p>
     <w:p>
@@ -3781,7 +3781,7 @@
         <w:ind w:firstLine="283"/>
       </w:pPr>
       <w:r>
-        <w:t>Diese einfache Frage — Was wünschst du dir? — war für sie neu.</w:t>
+        <w:t>Diese einfache Frage „Was wünschst du dir?" war für sie neu.</w:t>
       </w:r>
     </w:p>
     <w:p>
@@ -3853,7 +3853,7 @@
         <w:t>Echte Liebe ist gegenseitig.</w:t>
       </w:r>
       <w:r>
-        <w:t xml:space="preserve"> Das Geben und Nehmen ist nicht immer perfekt ausbalanciert — das wäre unrealistisch. Mal trägt einer mehr, dann der andere. In Krisen, in Krankheiten, in schwierigen Lebensphasen verschiebt sich das Gewicht. Das ist normal.</w:t>
+        <w:t xml:space="preserve"> Das Geben und Nehmen ist nicht immer perfekt ausbalanciert. Das wäre unrealistisch. Mal trägt einer mehr, dann der andere. In Krisen, in Krankheiten, in schwierigen Lebensphasen verschiebt sich das Gewicht. Das ist normal.</w:t>
       </w:r>
     </w:p>
     <w:p>
@@ -3960,7 +3960,7 @@
         <w:ind w:firstLine="283"/>
       </w:pPr>
       <w:r>
-        <w:t>Wenn eine Beziehung dich fast immer leerer macht als vorher — wenn du dich danach erschöpfter, kleiner, schlechter über dich selbst fühlst — dann ist das eine Information, die du ernst nehmen solltest.</w:t>
+        <w:t>Wenn eine Beziehung dich fast immer leerer macht als vorher, wenn du dich danach erschöpfter, kleiner, schlechter über dich selbst fühlst: Das ist eine Information, die du ernst nehmen solltest.</w:t>
       </w:r>
     </w:p>
     <w:p>
@@ -4145,7 +4145,7 @@
         <w:ind w:firstLine="283"/>
       </w:pPr>
       <w:r>
-        <w:t>Und ich sage dir von Anfang an: Es gibt keine Methode, die du heute anwendest und die morgen alles verändert. Wer dir das verspricht, lügt. Muster, die sich über Jahre oder Jahrzehnte aufgebaut haben, verändern sich nicht über Nacht. Aber sie verändern sich. Mit kleinen, konsequenten Schritten. Mit Geduld für dich selbst — besonders in den Momenten, wo du wieder in alte Muster fällst.</w:t>
+        <w:t>Und ich sage dir von Anfang an: Es gibt keine Methode, die du heute anwendest und die morgen alles verändert. Wer dir das verspricht, lügt. Muster, die sich über Jahre oder Jahrzehnte aufgebaut haben, verändern sich nicht über Nacht. Aber sie verändern sich. Mit kleinen, konsequenten Schritten. Mit Geduld für dich selbst, besonders in den Momenten, wo du wieder in alte Muster fällst.</w:t>
       </w:r>
     </w:p>
     <w:p>
@@ -4174,7 +4174,7 @@
         <w:ind w:firstLine="283"/>
       </w:pPr>
       <w:r>
-        <w:t>Die erste Antwort zeigt, wie weit der Selbstverlust gegangen ist. Die zweite zeigt das Muster in seiner reinsten Form. Die dritte — die Sehnsucht nach Ruhe — ist oft der erste echte Hinweis. Weil hinter dem Wunsch nach Ruhe fast immer der Wunsch nach sich selbst steckt.</w:t>
+        <w:t>Die erste Antwort zeigt, wie weit der Selbstverlust gegangen ist. Die zweite zeigt das Muster in seiner reinsten Form. Die dritte, die Sehnsucht nach Ruhe, ist oft der erste echte Hinweis. Weil hinter dem Wunsch nach Ruhe fast immer der Wunsch nach sich selbst steckt.</w:t>
       </w:r>
     </w:p>
     <w:p>
@@ -4190,7 +4190,7 @@
         <w:ind w:firstLine="283"/>
       </w:pPr>
       <w:r>
-        <w:t>Sabrina kam zu mir, weil sie nicht mehr weinte. Nicht weil sie glücklich war — sondern weil etwas in ihr zugemacht hatte. „Ich funktioniere," sagte sie. „Ich arbeite, ich koche, ich sehe Freunde, ich schlafe. Aber ich fühle nichts mehr dabei. Alles ist irgendwie... grau."</w:t>
+        <w:t>Sabrina kam zu mir, weil sie nicht mehr weinte. Nicht weil sie glücklich war, sondern weil etwas in ihr zugemacht hatte. „Ich funktioniere," sagte sie. „Ich arbeite, ich koche, ich sehe Freunde, ich schlafe. Aber ich fühle nichts mehr dabei. Alles ist irgendwie... grau."</w:t>
       </w:r>
     </w:p>
     <w:p>
@@ -4206,15 +4206,15 @@
         <w:ind w:firstLine="283"/>
       </w:pPr>
       <w:r>
-        <w:t>Sabrina hatte jahrelang für alle gefühlt — die Trauer ihrer Mutter, die Sorgen ihrer Freundinnen, die Erschöpfung ihres Partners. Sie hatte sich um alle emotionalen Zustände um sie herum gekümmert. Irgendwann waren keine Kapazitäten mehr für ihre eigenen Gefühle übrig.</w:t>
-      </w:r>
-    </w:p>
-    <w:p>
-      <w:pPr>
-        <w:ind w:firstLine="283"/>
-      </w:pPr>
-      <w:r>
-        <w:t>Das Zurückgewinnen begann bei ihr damit, dass sie lernte, ihre eigenen Gefühle als zuerst wahrzunehmen — bevor die der anderen.</w:t>
+        <w:t>Sabrina hatte jahrelang für alle gefühlt: die Trauer ihrer Mutter, die Sorgen ihrer Freundinnen, die Erschöpfung ihres Partners. Sie hatte sich um alle emotionalen Zustände um sie herum gekümmert. Irgendwann waren keine Kapazitäten mehr für ihre eigenen Gefühle übrig.</w:t>
+      </w:r>
+    </w:p>
+    <w:p>
+      <w:pPr>
+        <w:ind w:firstLine="283"/>
+      </w:pPr>
+      <w:r>
+        <w:t>Das Zurückgewinnen begann bei ihr damit, dass sie lernte, ihre eigenen Gefühle als zuerst wahrzunehmen, bevor die der anderen.</w:t>
       </w:r>
     </w:p>
     <w:p>
@@ -4302,7 +4302,7 @@
         <w:ind w:firstLine="283"/>
       </w:pPr>
       <w:r>
-        <w:t>Was macht dir Freude — abseits davon, für andere da zu sein? Was bringt dich zum Lachen? Was macht dich neugierig? Was hättest du gern gemacht, wenn niemand zuschauen würde?</w:t>
+        <w:t>Was macht dir Freude, abseits davon, für andere da zu sein? Was bringt dich zum Lachen? Was macht dich neugierig? Was hättest du gern gemacht, wenn niemand zuschauen würde?</w:t>
       </w:r>
     </w:p>
     <w:p>
@@ -4318,7 +4318,7 @@
         <w:ind w:firstLine="283"/>
       </w:pPr>
       <w:r>
-        <w:t>Sabrina — die Frau, die nicht mehr weinte — entdeckte ihre Freude an einem unerwarteten Ort. Sie fing an zu töpfern. Nicht weil jemand das von ihr wollte. Sondern weil sie als Kind einmal Ton in den Händen gehabt hatte und sich erinnerte, wie das sich angefühlt hatte.</w:t>
+        <w:t>Sabrina, die Frau, die nicht mehr weinte, entdeckte ihre Freude an einem unerwarteten Ort. Sie fing an zu töpfern. Nicht weil jemand das von ihr wollte. Sondern weil sie als Kind einmal Ton in den Händen gehabt hatte und sich erinnerte, wie das sich angefühlt hatte.</w:t>
       </w:r>
     </w:p>
     <w:p>
@@ -4355,7 +4355,7 @@
         <w:ind w:firstLine="283"/>
       </w:pPr>
       <w:r>
-        <w:t>Viele stellt die Frage, die irgendwann kommt, wenn man diesen Weg geht: Wenn ich aufhöre, die Retterin zu sein, die Märtyrerin — wer bin ich dann?</w:t>
+        <w:t>Viele stellt die Frage, die irgendwann kommt, wenn man diesen Weg geht: Wenn ich aufhöre, die Retterin zu sein, die Märtyrerin, wer bin ich dann?</w:t>
       </w:r>
     </w:p>
     <w:p>
@@ -4395,7 +4395,7 @@
         <w:ind w:firstLine="283"/>
       </w:pPr>
       <w:r>
-        <w:t>Eine Frage, die ich meinen Klientinnen in dieser Phase gerne mitgebe: „Was hätte ich als Kind werden wollen — wenn niemand eine Meinung dazu gehabt hätte?"</w:t>
+        <w:t>Eine Frage, die ich meinen Klientinnen in dieser Phase gerne mitgebe: „Was hätte ich als Kind werden wollen, wenn niemand eine Meinung dazu gehabt hätte?"</w:t>
       </w:r>
     </w:p>
     <w:p>
@@ -4491,7 +4491,7 @@
         <w:ind w:firstLine="283"/>
       </w:pPr>
       <w:r>
-        <w:t>Die dritte: Schreib eine Liste von Dingen, die dir früher Freude gemacht haben — oder von denen du denkst, dass sie dir Freude machen könnten. Und tu diese Woche eines davon. Nicht weil du es verdient hast. Einfach weil du es magst.</w:t>
+        <w:t>Die dritte: Schreib eine Liste von Dingen, die dir früher Freude gemacht haben, oder von denen du denkst, dass sie dir Freude machen könnten. Und tu diese Woche eines davon. Nicht weil du es verdient hast. Einfach weil du es magst.</w:t>
       </w:r>
     </w:p>
     <w:p>
@@ -4538,7 +4538,7 @@
           <w:i/>
           <w:sz w:val="21"/>
         </w:rPr>
-        <w:t>„Was ist der kleinste Schritt, den ich morgen für mich machen kann — und zwar nur für mich?"</w:t>
+        <w:t>„Was ist der kleinste Schritt, den ich morgen für mich machen kann, und zwar nur für mich?"</w:t>
       </w:r>
     </w:p>
     <w:p>
@@ -4572,7 +4572,7 @@
         <w:ind w:firstLine="283"/>
       </w:pPr>
       <w:r>
-        <w:t>Ich kenne eine Frau — ich nenne sie Magda — die mir einmal sagte: „Ich übe das Nein-Sagen seit zwei Jahren. Aber jedes Mal, wenn ich es tue, kommt dieses Gefühl. Dieses nagende, würgende Schuldgefühl. Wann hört das auf?"</w:t>
+        <w:t>Ich kenne eine Frau, ich nenne sie Magda, die mir einmal sagte: „Ich übe das Nein-Sagen seit zwei Jahren. Aber jedes Mal, wenn ich es tue, kommt dieses Gefühl. Dieses nagende, würgende Schuldgefühl. Wann hört das auf?"</w:t>
       </w:r>
     </w:p>
     <w:p>
@@ -4596,7 +4596,7 @@
         <w:ind w:firstLine="283"/>
       </w:pPr>
       <w:r>
-        <w:t>Magda hatte vierzig Jahre lang Ja gesagt. Zu ihrer Mutter, die regelmässig Besuche verlangte, auch wenn Magda arbeitete. Zu ihrer Chefin, die immer dann Überstunden verlangte, wenn Magda eigentlich freie Abende hatte. Zu ihren Freundinnen, die ihre emotionalen Krisen mit ihr teilten — aber selten umgekehrt fragten.</w:t>
+        <w:t>Magda hatte vierzig Jahre lang Ja gesagt. Zu ihrer Mutter, die regelmässig Besuche verlangte, auch wenn Magda arbeitete. Zu ihrer Chefin, die immer dann Überstunden verlangte, wenn Magda eigentlich freie Abende hatte. Zu ihren Freundinnen, die ihre emotionalen Krisen mit ihr teilten, aber selten umgekehrt fragten.</w:t>
       </w:r>
     </w:p>
     <w:p>
@@ -4633,7 +4633,7 @@
         <w:ind w:firstLine="283"/>
       </w:pPr>
       <w:r>
-        <w:t>Aber sie tat es nicht. Und am nächsten Nachmittag telefonierten sie — und es war genauso wie immer.</w:t>
+        <w:t>Aber sie tat es nicht. Und am nächsten Nachmittag telefonierten sie, und es war genauso wie immer.</w:t>
       </w:r>
     </w:p>
     <w:p>
@@ -4713,7 +4713,7 @@
         <w:ind w:firstLine="283"/>
       </w:pPr>
       <w:r>
-        <w:t>Falsches Gewissen meldet sich, wenn du eine Grenze setzt, deine Bedürfnisse ausdrückst, Nein sagst — ohne dass du damit jemandem wirklich schadest.</w:t>
+        <w:t>Falsches Gewissen meldet sich, wenn du eine Grenze setzt, deine Bedürfnisse ausdrückst, Nein sagst, ohne dass du damit jemandem wirklich schadest.</w:t>
       </w:r>
     </w:p>
     <w:p>
@@ -4753,7 +4753,7 @@
         <w:ind w:firstLine="283"/>
       </w:pPr>
       <w:r>
-        <w:t>Das fühlt sich für viele Frauen unmöglich an — als wäre ein unbegründetes Nein respektlos, als müsstest du der anderen Person beweisen, dass du einen guten Grund hast. Aber je mehr du begründest, desto mehr lädst du den anderen ein, die Begründung zu widerlegen. Und das passiert. „Du könntest aber doch..." „Das ist kein wirklicher Grund..." „Ich dachte, wir sind Freundinnen..."</w:t>
+        <w:t>Das fühlt sich für viele Frauen unmöglich an, als wäre ein unbegründetes Nein respektlos, als müsstest du der anderen Person beweisen, dass du einen guten Grund hast. Aber je mehr du begründest, desto mehr lädst du den anderen ein, die Begründung zu widerlegen. Und das passiert. „Du könntest aber doch..." „Das ist kein wirklicher Grund..." „Ich dachte, wir sind Freundinnen..."</w:t>
       </w:r>
     </w:p>
     <w:p>
@@ -4866,15 +4866,15 @@
         <w:ind w:firstLine="283"/>
       </w:pPr>
       <w:r>
-        <w:t>Wenn du immer Ja sagst, auch wenn du Nein meinst, hilfst du der anderen Person nicht wirklich. Du hilfst ihr, eine Dynamik aufrechtzuerhalten, die nicht nachhaltig ist. Du vermittelst ihr, dass sie immer auf dich zählen kann — ohne Grenzen, ohne Rücksicht. Du trägst dazu bei, dass sie sich nicht entwickeln muss.</w:t>
-      </w:r>
-    </w:p>
-    <w:p>
-      <w:pPr>
-        <w:ind w:firstLine="283"/>
-      </w:pPr>
-      <w:r>
-        <w:t>Wenn du Nein sagst, gibst du der anderen Person die Möglichkeit, auch mal selbst eine Lösung zu finden. Die Möglichkeit, sich selbst zu helfen. Die Möglichkeit, eine echte Beziehung mit dir aufzubauen — eine, in der beide ehrlich sind.</w:t>
+        <w:t>Wenn du immer Ja sagst, auch wenn du Nein meinst, hilfst du der anderen Person nicht wirklich. Du hilfst ihr, eine Dynamik aufrechtzuerhalten, die nicht nachhaltig ist. Du vermittelst ihr, dass sie immer auf dich zählen kann, ohne Grenzen, ohne Rücksicht. Du trägst dazu bei, dass sie sich nicht entwickeln muss.</w:t>
+      </w:r>
+    </w:p>
+    <w:p>
+      <w:pPr>
+        <w:ind w:firstLine="283"/>
+      </w:pPr>
+      <w:r>
+        <w:t>Wenn du Nein sagst, gibst du der anderen Person die Möglichkeit, auch mal selbst eine Lösung zu finden. Die Möglichkeit, sich selbst zu helfen. Die Möglichkeit, eine echte Beziehung mit dir aufzubauen, eine, in der beide ehrlich sind.</w:t>
       </w:r>
     </w:p>
     <w:p>
@@ -4890,7 +4890,7 @@
         <w:ind w:firstLine="283"/>
       </w:pPr>
       <w:r>
-        <w:t>Ich denke an Hanna, sechsunddreissig Jahre alt, Sozialpädagogin. Hanna hatte über Jahre hinweg den emotionalen Notfallkontakt für ihre gesamte Freundesgruppe gespielt. Jeder Streit, jede Krise, jedes Tief — Hanna war da.</w:t>
+        <w:t>Ich denke an Hanna, sechsunddreissig Jahre alt, Sozialpädagogin. Hanna hatte über Jahre hinweg den emotionalen Notfallkontakt für ihre gesamte Freundesgruppe gespielt. Jeder Streit, jede Krise, jedes Tief: Hanna war da.</w:t>
       </w:r>
     </w:p>
     <w:p>
@@ -4950,7 +4950,7 @@
         <w:t>Erste Stufe: Das innere Nein.</w:t>
       </w:r>
       <w:r>
-        <w:t xml:space="preserve"> Wenn jemand etwas von dir verlangt, mach eine kurze innere Pause. Spür nach: Will ich das? Kann ich das? Auch wenn du dann Ja sagst — das innere Nein wahrzunehmen ist der erste Schritt.</w:t>
+        <w:t xml:space="preserve"> Wenn jemand etwas von dir verlangt, mach eine kurze innere Pause. Spür nach: Will ich das? Kann ich das? Auch wenn du dann Ja sagst, das innere Nein wahrzunehmen ist der erste Schritt.</w:t>
       </w:r>
     </w:p>
     <w:p>
@@ -5004,7 +5004,7 @@
         <w:ind w:firstLine="283"/>
       </w:pPr>
       <w:r>
-        <w:t>Menschen, die dich wirklich respektieren, werden dein Nein akzeptieren — auch wenn sie enttäuscht sind.</w:t>
+        <w:t>Menschen, die dich wirklich respektieren, werden dein Nein akzeptieren, auch wenn sie enttäuscht sind.</w:t>
       </w:r>
     </w:p>
     <w:p>
@@ -5109,7 +5109,7 @@
         <w:ind w:firstLine="283"/>
       </w:pPr>
       <w:r>
-        <w:t>Das ist keine Theorie. Das ist so sicher wie die Schwerkraft. Wenn du anfängst, Grenzen zu setzen, Bedürfnisse zu benennen, Nein zu sagen — dann verändert sich die Dynamik. Zwangsläufig.</w:t>
+        <w:t>Das ist keine Theorie. Das ist so sicher wie die Schwerkraft. Wenn du anfängst, Grenzen zu setzen, Bedürfnisse zu benennen, Nein zu sagen: dann verändert sich die Dynamik. Zwangsläufig.</w:t>
       </w:r>
     </w:p>
     <w:p>
@@ -5180,7 +5180,7 @@
         <w:t>Wachstum.</w:t>
       </w:r>
       <w:r>
-        <w:t xml:space="preserve"> Der andere spürt, dass sich etwas verändert hat. Es gibt Reibung, unbequeme Gespräche, eine Phase der Unsicherheit. Aber die Beziehung kommt tiefer heraus. Echter. Nährender. Das passiert, wenn das Fundament solide ist — wenn unter der ungesunden Dynamik echte Zuneigung und echter Respekt lagen.</w:t>
+        <w:t xml:space="preserve"> Der andere spürt, dass sich etwas verändert hat. Es gibt Reibung, unbequeme Gespräche, eine Phase der Unsicherheit. Aber die Beziehung kommt tiefer heraus. Echter. Nährender. Das passiert, wenn das Fundament solide ist, wenn unter der ungesunden Dynamik echte Zuneigung und echter Respekt lagen.</w:t>
       </w:r>
     </w:p>
     <w:p>
@@ -5258,7 +5258,7 @@
         <w:ind w:firstLine="283"/>
       </w:pPr>
       <w:r>
-        <w:t>Sondern Ehrlichkeit: „Ich merke, dass ich mich in unserer Beziehung oft leer fühle. Ich brauche mehr Gegenseitigkeit. Ich brauche, dass du manchmal fragst, wie es mir geht. Ich brauche, dass ich auch Nein sagen darf — und dass du das akzeptierst."</w:t>
+        <w:t>Sondern Ehrlichkeit: „Ich merke, dass ich mich in unserer Beziehung oft leer fühle. Ich brauche mehr Gegenseitigkeit. Ich brauche, dass du manchmal fragst, wie es mir geht. Ich brauche, dass ich auch Nein sagen darf, und dass du das akzeptierst."</w:t>
       </w:r>
     </w:p>
     <w:p>
@@ -5282,7 +5282,7 @@
         <w:ind w:firstLine="283"/>
       </w:pPr>
       <w:r>
-        <w:t>Ich denke an Markus und Sonja — sie kam zu mir, er kam nie, aber ich lernte ihn durch ihre Beschreibungen kennen. Nach dreizehn Jahren Ehe hatte Sonja begonnen, sich zu verändern. Sie hatte Grenzen gesetzt. Sie hatte gesagt, was sie brauchte. Und Markus hatte — langsam, holprig, manchmal widerwillig — angefangen zuzuhören.</w:t>
+        <w:t>Ich denke an Markus und Sonja. Sie kam zu mir, er nie, aber ich lernte ihn durch ihre Beschreibungen kennen. Nach dreizehn Jahren Ehe hatte Sonja begonnen, sich zu verändern. Sie hatte Grenzen gesetzt. Sie hatte gesagt, was sie brauchte. Und Markus hatte — langsam, holprig, manchmal widerwillig — angefangen zuzuhören.</w:t>
       </w:r>
     </w:p>
     <w:p>
@@ -5319,7 +5319,7 @@
         <w:ind w:firstLine="283"/>
       </w:pPr>
       <w:r>
-        <w:t>Ich möchte auch klar sagen, was toxisch bedeutet — weil das Wort oft falsch verwendet wird.</w:t>
+        <w:t>Ich möchte auch klar sagen, was toxisch bedeutet, weil das Wort oft falsch verwendet wird.</w:t>
       </w:r>
     </w:p>
     <w:p>
@@ -5343,7 +5343,7 @@
         <w:ind w:firstLine="283"/>
       </w:pPr>
       <w:r>
-        <w:t>wenn jemand dich systematisch kleinmacht, erniedrigt oder kontrolliert — nicht einmalig, sondern als Muster. Wenn jemand deine Grenzen immer wieder verletzt, trotz klarer Kommunikation. Wenn du Angst hast, deine Meinung zu äussern — nicht Unbehagen, sondern Angst. Wenn die Beziehung deiner Gesundheit schadet: du schläfst nicht, du isst nicht, du funktionierst nicht mehr. Wenn es ein dauerhaftes Muster von Versprechen und gebrochenen Versprechen gibt, das sich nie wirklich ändert — egal was du sagst, egal wie sehr du dich anpasst.</w:t>
+        <w:t>wenn jemand dich systematisch kleinmacht, erniedrigt oder kontrolliert, nicht einmalig, sondern als Muster. Wenn jemand deine Grenzen immer wieder verletzt, trotz klarer Kommunikation. Wenn du Angst hast, deine Meinung zu äussern, nicht Unbehagen, sondern Angst. Wenn die Beziehung deiner Gesundheit schadet: du schläfst nicht, du isst nicht, du funktionierst nicht mehr. Wenn es ein dauerhaftes Muster von Versprechen und gebrochenen Versprechen gibt, das sich nie wirklich ändert, egal was du sagst, egal wie sehr du dich anpasst.</w:t>
       </w:r>
     </w:p>
     <w:p>
@@ -5359,7 +5359,7 @@
         <w:ind w:firstLine="283"/>
       </w:pPr>
       <w:r>
-        <w:t>Und wenn du in einer solchen Situation bist: Hol dir Unterstützung. Dieses Buch ist ein Anfang. Es ersetzt keine professionelle Begleitung, wenn die Situation ernst ist. Und manchmal ist die klügste Entscheidung, die du treffen kannst, dir Hilfe zu holen — nicht weil du schwach bist, sondern weil du weiss bist.</w:t>
+        <w:t>Und wenn du in einer solchen Situation bist: Hol dir Unterstützung. Dieses Buch ist ein Anfang. Es ersetzt keine professionelle Begleitung, wenn die Situation ernst ist. Und manchmal ist die klügste Entscheidung, die du treffen kannst, dir Hilfe zu holen, nicht weil du schwach bist, sondern weil du weiss bist.</w:t>
       </w:r>
     </w:p>
     <w:p>
@@ -5383,7 +5383,7 @@
         <w:ind w:firstLine="283"/>
       </w:pPr>
       <w:r>
-        <w:t>Es gibt Beziehungen, die nicht mitgehen können, wenn du wächst. Das sage ich nicht leichtfertig. Loslassen ist einer der schmerzhaftesten Prozesse, den ich kenne — besonders wenn man jemanden liebt, auch wenn die Beziehung einen nicht gut tut.</w:t>
+        <w:t>Es gibt Beziehungen, die nicht mitgehen können, wenn du wächst. Das sage ich nicht leichtfertig. Loslassen ist einer der schmerzhaftesten Prozesse, den ich kenne, besonders wenn man jemanden liebt, auch wenn die Beziehung einen nicht gut tut.</w:t>
       </w:r>
     </w:p>
     <w:p>
@@ -5407,7 +5407,7 @@
         <w:ind w:firstLine="283"/>
       </w:pPr>
       <w:r>
-        <w:t>Eine Frau, die ich über eineinhalb Jahre begleitete — ich nenne sie Theresa — beschrieb es so: „Es war nicht ein grosses Ereignis. Es war ein Morgen, an dem ich aufgewacht bin und gedacht habe: Ich habe keine Kraft mehr, gegen das anzukämpfen, was ich weiss."</w:t>
+        <w:t>Eine Frau, die ich über eineinhalb Jahre begleitete, ich nenne sie Theresa, beschrieb es so: „Es war nicht ein grosses Ereignis. Es war ein Morgen, an dem ich aufgewacht bin und gedacht habe: Ich habe keine Kraft mehr, gegen das anzukämpfen, was ich weiss."</w:t>
       </w:r>
     </w:p>
     <w:p>
@@ -5431,7 +5431,7 @@
         <w:ind w:firstLine="283"/>
       </w:pPr>
       <w:r>
-        <w:t>Aber manchmal schafft das Loslassen den Raum für beide, zu wachsen — getrennt voneinander, als eigene, ganze Menschen.</w:t>
+        <w:t>Aber manchmal schafft das Loslassen den Raum für beide, zu wachsen, getrennt voneinander, als eigene, ganze Menschen.</w:t>
       </w:r>
     </w:p>
     <w:p>
@@ -5455,7 +5455,7 @@
         <w:ind w:firstLine="283"/>
       </w:pPr>
       <w:r>
-        <w:t>Wenn du dich verändert hast — wenn du weisst, wer du bist und was du brauchst — dann veränderst du auch, wen du in dein Leben lässt.</w:t>
+        <w:t>Wenn du dich verändert hast, wenn du weisst, wer du bist und was du brauchst, dann veränderst du auch, wen du in dein Leben lässt.</w:t>
       </w:r>
     </w:p>
     <w:p>
@@ -5597,7 +5597,7 @@
         <w:ind w:firstLine="283"/>
       </w:pPr>
       <w:r>
-        <w:t>Du bist verantwortlich für deinen Beitrag zu Beziehungen. Für deine Ehrlichkeit. Für das, was du gibst — aus Fülle und aus freier Entscheidung. Aber nicht dafür, dass andere glücklich sind.</w:t>
+        <w:t>Du bist verantwortlich für deinen Beitrag zu Beziehungen. Für deine Ehrlichkeit. Für das, was du gibst, aus Fülle und aus freier Entscheidung. Aber nicht dafür, dass andere glücklich sind.</w:t>
       </w:r>
     </w:p>
     <w:p>
@@ -5621,7 +5621,7 @@
         <w:ind w:firstLine="283"/>
       </w:pPr>
       <w:r>
-        <w:t>Ich denke an Brigitte, siebenundvierzig Jahre alt, Mutter von zwei Söhnen im Teenageralter. Brigitte war zu mir gekommen, weil sie sich ständig schuldig fühlte — nicht wegen etwas Konkretem, sondern als Hintergrundgeräusch, immer vorhanden.</w:t>
+        <w:t>Ich denke an Brigitte, siebenundvierzig Jahre alt, Mutter von zwei Söhnen im Teenageralter. Brigitte war zu mir gekommen, weil sie sich ständig schuldig fühlte, nicht wegen etwas Konkretem, sondern als Hintergrundgeräusch, immer vorhanden.</w:t>
       </w:r>
     </w:p>
     <w:p>
@@ -5642,7 +5642,7 @@
         <w:ind w:firstLine="283"/>
       </w:pPr>
       <w:r>
-        <w:t>Ich fragte sie: „Und wenn er nach Hause kommt und gute Laune hat — wem schreibst du das zu?"</w:t>
+        <w:t>Ich fragte sie: „Und wenn er nach Hause kommt und gute Laune hat, wem schreibst du das zu?"</w:t>
       </w:r>
     </w:p>
     <w:p>
@@ -5743,7 +5743,7 @@
         <w:ind w:firstLine="283"/>
       </w:pPr>
       <w:r>
-        <w:t>Und hier liegt das Paradoxe: Wenn du aufhörst, das Glück anderer zu kontrollieren — wenn du anfängst, dich auf das zu konzentrieren, was du wirklich kontrollieren kannst — wirst du mehr Einfluss auf deine Beziehungen haben als je zuvor. Weil du authentisch bist. Weil du aus Stärke gibst statt aus Angst. Weil du der Mensch wirst, mit dem echte Verbindung möglich ist.</w:t>
+        <w:t>Und hier liegt das Paradoxe: Wenn du aufhörst, das Glück anderer zu kontrollieren, wenn du anfängst, dich auf das zu konzentrieren, was du wirklich kontrollieren kannst, wirst du mehr Einfluss auf deine Beziehungen haben als je zuvor. Weil du authentisch bist. Weil du aus Stärke gibst statt aus Angst. Weil du der Mensch wirst, mit dem echte Verbindung möglich ist.</w:t>
       </w:r>
     </w:p>
     <w:p>
@@ -5775,7 +5775,7 @@
         <w:ind w:firstLine="283"/>
       </w:pPr>
       <w:r>
-        <w:t>Manchmal bedeutet echte Fürsorge, jemanden mit seinen Konsequenzen zu lassen. Das ist schwer zu hören. Wenn jemand, den du liebst, schlechte Entscheidungen trifft — und du wieder einspringst, wieder auffängst, wieder rettest — schützt du die Person vor dem Ergebnis ihrer Entscheidungen. Das fühlt sich nach Liebe an. Es verhindert aber Wachstum.</w:t>
+        <w:t>Manchmal bedeutet echte Fürsorge, jemanden mit seinen Konsequenzen zu lassen. Das ist schwer zu hören. Wenn jemand, den du liebst, schlechte Entscheidungen trifft, und du wieder einspringst, wieder auffängst, wieder rettest, schützt du die Person vor dem Ergebnis ihrer Entscheidungen. Das fühlt sich nach Liebe an. Es verhindert aber Wachstum.</w:t>
       </w:r>
     </w:p>
     <w:p>
@@ -5791,7 +5791,7 @@
         <w:ind w:firstLine="283"/>
       </w:pPr>
       <w:r>
-        <w:t>Ich denke an eine Klientin, die ich über zwei Jahre begleitet habe — ich nenne sie Nina. Nina hatte eine Tochter, die immer wieder in schwierige Beziehungen geriet. Jedes Mal, wenn die Tochter in einer Krise war, war Nina sofort da. Fuhr durch die halbe Stadt. Liess alles stehen und liegen. Hörte stundenlang zu.</w:t>
+        <w:t>Ich denke an eine Klientin, die ich über zwei Jahre begleitet habe, ich nenne sie Nina. Nina hatte eine Tochter, die immer wieder in schwierige Beziehungen geriet. Jedes Mal, wenn die Tochter in einer Krise war, war Nina sofort da. Fuhr durch die halbe Stadt. Liess alles stehen und liegen. Hörte stundenlang zu.</w:t>
       </w:r>
     </w:p>
     <w:p>
@@ -5828,7 +5828,7 @@
         <w:ind w:firstLine="283"/>
       </w:pPr>
       <w:r>
-        <w:t>Es war ein langsamer Prozess. Nina lernte, der Tochter anders zur Seite zu stehen — präsent, aber nicht rettend. Da, ohne die Konsequenzen wegzuräumen.</w:t>
+        <w:t>Es war ein langsamer Prozess. Nina lernte, der Tochter anders zur Seite zu stehen: präsent, aber nicht rettend. Da, ohne die Konsequenzen wegzuräumen.</w:t>
       </w:r>
     </w:p>
     <w:p>
@@ -5931,7 +5931,7 @@
           <w:i/>
           <w:sz w:val="21"/>
         </w:rPr>
-        <w:t>„Für wessen Glück fühle ich mich am stärksten verantwortlich — und warum?"</w:t>
+        <w:t>„Für wessen Glück fühle ich mich am stärksten verantwortlich, und warum?"</w:t>
       </w:r>
     </w:p>
     <w:p>
@@ -6042,7 +6042,7 @@
         <w:ind w:firstLine="283"/>
       </w:pPr>
       <w:r>
-        <w:t>Es ist kein mystisches Konzept. Es ist eine Metapher für etwas sehr Reales: die emotionalen Prägungen, Überzeugungen und Überlebensmuster, die wir in der Kindheit entwickelt haben. Und die wir — weil das Gehirn so funktioniert — tief in uns tragen, weit über die Kindheit hinaus.</w:t>
+        <w:t>Es ist kein mystisches Konzept. Es ist eine Metapher für etwas sehr Reales: die emotionalen Prägungen, Überzeugungen und Überlebensmuster, die wir in der Kindheit entwickelt haben. Und die wir, weil das Gehirn so funktioniert, tief in uns tragen, weit über die Kindheit hinaus.</w:t>
       </w:r>
     </w:p>
     <w:p>
@@ -6058,7 +6058,7 @@
         <w:ind w:firstLine="283"/>
       </w:pPr>
       <w:r>
-        <w:t>Das Gehirn speichert Erfahrungen nicht wie ein Archiv, das wir irgendwann schliessen. Es speichert sie als Muster. Als körperliche Reaktionen, als emotionale Reflexe, als automatische Handlungsstrategien. Diese Muster aktivieren sich, lange bevor der rationale Verstand eingreift. Du kannst dich als vierzigjährige Frau verhalten wie ein überredetes Kind — und einen Moment später denkst du: Was war das gerade?</w:t>
+        <w:t>Das Gehirn speichert Erfahrungen nicht wie ein Archiv, das wir irgendwann schliessen. Es speichert sie als Muster. Als körperliche Reaktionen, als emotionale Reflexe, als automatische Handlungsstrategien. Diese Muster aktivieren sich, lange bevor der rationale Verstand eingreift. Du kannst dich als vierzigjährige Frau verhalten wie ein überredetes Kind, und einen Moment später denkst du: Was war das gerade?</w:t>
       </w:r>
     </w:p>
     <w:p>
@@ -6114,7 +6114,7 @@
         <w:ind w:firstLine="283"/>
       </w:pPr>
       <w:r>
-        <w:t>Ich denke an eine Klientin — ich nenne sie Bettina, 44 Jahre alt, Lehrerin.</w:t>
+        <w:t>Ich denke an eine Klientin: Bettina, 44 Jahre alt, Lehrerin.</w:t>
       </w:r>
     </w:p>
     <w:p>
@@ -6167,7 +6167,7 @@
           <w:i/>
           <w:sz w:val="21"/>
         </w:rPr>
-        <w:t>„Aber mein Partner ist nicht mein Vater," sagte Bettina nach dieser Erkenntnis. Sie war halbwegs ärgerlich auf sich selbst — das Typische: sich selbst Vernunft predigen.</w:t>
+        <w:t>„Aber mein Partner ist nicht mein Vater," sagte Bettina nach dieser Erkenntnis. Sie war halbwegs ärgerlich auf sich selbst, das Typische: sich selbst Vernunft predigen.</w:t>
       </w:r>
     </w:p>
     <w:p>
@@ -6204,7 +6204,7 @@
         <w:ind w:firstLine="283"/>
       </w:pPr>
       <w:r>
-        <w:t>Joana hatte alles im Griff. Zwei Kinder, Teilzeitstelle, Ehemann, Haushalt — organisiert und funktionierend. Ausserdem übernahm sie in der Familie die Rolle der Vermittlerin. Wenn zwischen ihrem Bruder und ihrer Mutter Spannungen entstanden, rief sie an, glättete, erklärte die eine Seite der anderen.</w:t>
+        <w:t>Joana hatte alles im Griff. Zwei Kinder, Teilzeitstelle, Ehemann, Haushalt, organisiert und funktionierend. Ausserdem übernahm sie in der Familie die Rolle der Vermittlerin. Wenn zwischen ihrem Bruder und ihrer Mutter Spannungen entstanden, rief sie an, glättete, erklärte die eine Seite der anderen.</w:t>
       </w:r>
     </w:p>
     <w:p>
@@ -6228,7 +6228,7 @@
         <w:ind w:firstLine="283"/>
       </w:pPr>
       <w:r>
-        <w:t>Mit dreiundzwanzig Monaten hatte Joanas Nervensystem beschlossen: Meine Aufgabe ist es, den Frieden zu wahren. Fast vier Jahrzehnte später tat es das noch immer — auch wenn der eigentliche Konflikt längst vorbei war.</w:t>
+        <w:t>Mit dreiundzwanzig Monaten hatte Joanas Nervensystem beschlossen: Meine Aufgabe ist es, den Frieden zu wahren. Fast vier Jahrzehnte später tat es das noch immer, auch wenn der eigentliche Konflikt längst vorbei war.</w:t>
       </w:r>
     </w:p>
     <w:p>
@@ -6324,15 +6324,15 @@
         <w:ind w:firstLine="283"/>
       </w:pPr>
       <w:r>
-        <w:t>Reagiere ich gerade auf das, was wirklich passiert — oder auf etwas, das früher passiert ist?</w:t>
-      </w:r>
-    </w:p>
-    <w:p>
-      <w:pPr>
-        <w:ind w:firstLine="283"/>
-      </w:pPr>
-      <w:r>
-        <w:t>Das ist nicht immer leicht zu beantworten. Oft braucht es einen Moment der Stille, bevor man merkt: Diese Emotion ist zu gross für diesen Anlass. Sie gehört nicht hierher. Sie gehört dorthin — in ein Zimmer meiner Kindheit, in einen Moment, den ich längst vergessen glaubte.</w:t>
+        <w:t>Reagiere ich gerade auf das, was wirklich passiert, oder auf etwas, das früher passiert ist?</w:t>
+      </w:r>
+    </w:p>
+    <w:p>
+      <w:pPr>
+        <w:ind w:firstLine="283"/>
+      </w:pPr>
+      <w:r>
+        <w:t>Das ist nicht immer leicht zu beantworten. Oft braucht es einen Moment der Stille, bevor man merkt: Diese Emotion ist zu gross für diesen Anlass. Sie gehört nicht hierher. Sie gehört dorthin: in ein Zimmer meiner Kindheit, in einen Moment, den ich längst vergessen glaubte.</w:t>
       </w:r>
     </w:p>
     <w:p>
@@ -6396,7 +6396,7 @@
         <w:ind w:firstLine="283"/>
       </w:pPr>
       <w:r>
-        <w:t>Der erste Schritt ist so einfach, dass er fast absurd klingt: Wenn du dich das nächste Mal in einer Situation findest, wo du unverhältnismässig reagierst — inne halten. Und dich fragen: Wie alt fühle ich mich gerade?</w:t>
+        <w:t>Der erste Schritt ist so einfach, dass er fast absurd klingt: Wenn du dich das nächste Mal in einer Situation findest, wo du unverhältnismässig reagierst, innehalten. Und dich fragen: Wie alt fühle ich mich gerade?</w:t>
       </w:r>
     </w:p>
     <w:p>
@@ -6574,7 +6574,7 @@
           <w:i/>
           <w:sz w:val="21"/>
         </w:rPr>
-        <w:t>„Was hat das Kind, das ich war, am meisten gebraucht — und nicht bekommen?"</w:t>
+        <w:t>„Was hat das Kind, das ich war, am meisten gebraucht, und nicht bekommen?"</w:t>
       </w:r>
     </w:p>
     <w:p>
@@ -6671,7 +6671,7 @@
         <w:ind w:firstLine="283"/>
       </w:pPr>
       <w:r>
-        <w:t>Das ist keine Anklage und kein Urteil über diese Menschen. Es ist eine Beschreibung von Dynamiken — damit du sie erkennen kannst. Damit du weisst, was du wirklich siehst, wenn du in einer solchen Beziehung bist.</w:t>
+        <w:t>Das ist keine Anklage und kein Urteil über diese Menschen. Es ist eine Beschreibung von Dynamiken, damit du sie erkennen kannst. Damit du weisst, was du wirklich siehst, wenn du in einer solchen Beziehung bist.</w:t>
       </w:r>
     </w:p>
     <w:p>
@@ -6812,7 +6812,7 @@
         <w:t>Intermittierende Verstärkung.</w:t>
       </w:r>
       <w:r>
-        <w:t xml:space="preserve"> Auf eine Phase der Kälte folgt plötzlich grosse Wärme. Ein unerwartetes Geschenk, ein romantischer Abend, ein Brief wie in den Anfängen. Du bist erleichtert, hoffst, dass es jetzt besser wird. Dann kommt wieder die Kälte. Dieses Muster erzeugt eine emotionale Abhängigkeit, die sich anfühlt wie starke Liebe, aber keine ist. Es ist das Prinzip des unberechenbaren Belohnungssystems — das süchtig macht.</w:t>
+        <w:t xml:space="preserve"> Auf eine Phase der Kälte folgt plötzlich grosse Wärme. Ein unerwartetes Geschenk, ein romantischer Abend, ein Brief wie in den Anfängen. Du bist erleichtert, hoffst, dass es jetzt besser wird. Dann kommt wieder die Kälte. Dieses Muster erzeugt eine emotionale Abhängigkeit, die sich anfühlt wie starke Liebe, aber keine ist. Es ist das Prinzip des unberechenbaren Belohnungssystems, das süchtig macht.</w:t>
       </w:r>
     </w:p>
     <w:p>
@@ -6857,7 +6857,7 @@
         <w:t>Reaktion auf Grenzen.</w:t>
       </w:r>
       <w:r>
-        <w:t xml:space="preserve"> Wenn du eine Grenze setzt, kommt Wut. Oder tagelanges Schweigen. Oder Schuldgefühle, die du danach trägst: „Ich mache mir solche Sorgen um uns." „Ich wusste, dass du dich veränderst." Die Grenze wird so teuer gemacht, dass du aufhörst, sie zu setzen. Das ist kein Zufall. Das ist Absicht — auch wenn der andere das vielleicht nicht bewusst plant.</w:t>
+        <w:t xml:space="preserve"> Wenn du eine Grenze setzt, kommt Wut. Oder tagelanges Schweigen. Oder Schuldgefühle, die du danach trägst: „Ich mache mir solche Sorgen um uns." „Ich wusste, dass du dich veränderst." Die Grenze wird so teuer gemacht, dass du aufhörst, sie zu setzen. Das ist kein Zufall. Das ist Absicht, auch wenn der andere das vielleicht nicht bewusst plant.</w:t>
       </w:r>
     </w:p>
     <w:p>
@@ -6888,7 +6888,7 @@
         <w:ind w:firstLine="283"/>
       </w:pPr>
       <w:r>
-        <w:t>Ich denke an eine Klientin — Silvia, Mitte vierzig.</w:t>
+        <w:t>Ich denke an eine Klientin: Silvia, Mitte vierzig.</w:t>
       </w:r>
     </w:p>
     <w:p>
@@ -7164,7 +7164,7 @@
         <w:ind w:firstLine="283"/>
       </w:pPr>
       <w:r>
-        <w:t>Schreib auf, was passiert. Nicht um Beweise zu sammeln, sondern um deiner eigenen Wahrnehmung einen Anker zu geben. Menschen in Gaslighting-Situationen verlieren mit der Zeit das Vertrauen in ihr eigenes Gedächtnis. Das ist kein Zufall — es ist ein Effekt des Musters. Das Aufschreiben hilft, den Boden unter den Füssen zu behalten.</w:t>
+        <w:t>Schreib auf, was passiert. Nicht um Beweise zu sammeln, sondern um deiner eigenen Wahrnehmung einen Anker zu geben. Menschen in Gaslighting-Situationen verlieren mit der Zeit das Vertrauen in ihr eigenes Gedächtnis. Das ist kein Zufall: Es ist ein Effekt des Musters. Das Aufschreiben hilft, den Boden unter den Füssen zu behalten.</w:t>
       </w:r>
     </w:p>
     <w:p>
@@ -7276,7 +7276,7 @@
         <w:ind w:firstLine="283"/>
       </w:pPr>
       <w:r>
-        <w:t>Wenn du alles versucht hast, wenn du kommuniziert, Grenzen gesetzt, um Unterstützung gebeten, und nichts hat sich verändert — dann ist das eine Information.</w:t>
+        <w:t>Wenn du alles versucht hast, wenn du kommuniziert, Grenzen gesetzt, um Unterstützung gebeten, und nichts hat sich verändert: Das ist eine Information.</w:t>
       </w:r>
     </w:p>
     <w:p>
@@ -7292,7 +7292,7 @@
         <w:ind w:firstLine="283"/>
       </w:pPr>
       <w:r>
-        <w:t>Was du damit machst, ist deine Entscheidung. Aber du hast das Recht, sie zu treffen — mit offenen Augen, mit vollem Verstand und mit dem Wissen, dass du alles Notwendige getan hast.</w:t>
+        <w:t>Was du damit machst, ist deine Entscheidung. Aber du hast das Recht, sie zu treffen: mit offenen Augen, mit vollem Verstand und mit dem Wissen, dass du alles Notwendige getan hast.</w:t>
       </w:r>
     </w:p>
     <w:p>
@@ -7318,7 +7318,7 @@
           <w:i/>
           <w:sz w:val="21"/>
         </w:rPr>
-        <w:t>„Welche der beschriebenen Muster erkenne ich wieder — und wie lange schon?"</w:t>
+        <w:t>„Welche der beschriebenen Muster erkenne ich wieder, und wie lange schon?"</w:t>
       </w:r>
     </w:p>
     <w:p>
@@ -7344,7 +7344,7 @@
           <w:i/>
           <w:sz w:val="21"/>
         </w:rPr>
-        <w:t>„Was hat sich auf meiner Seite in dieser Beziehung verändert — und was hat sich auf der Seite des anderen verändert?"</w:t>
+        <w:t>„Was hat sich auf meiner Seite in dieser Beziehung verändert, und was hat sich auf der Seite des anderen verändert?"</w:t>
       </w:r>
     </w:p>
     <w:p>
@@ -7357,7 +7357,7 @@
           <w:i/>
           <w:sz w:val="21"/>
         </w:rPr>
-        <w:t>„Was brauche ich als nächsten Schritt — nicht um die Beziehung zu retten, sondern um mir selbst gegenüber ehrlich zu sein?"</w:t>
+        <w:t>„Was brauche ich als nächsten Schritt, nicht um die Beziehung zu retten, sondern um mir selbst gegenüber ehrlich zu sein?"</w:t>
       </w:r>
     </w:p>
     <w:p>
@@ -7473,7 +7473,7 @@
         <w:t>Passiv:</w:t>
       </w:r>
       <w:r>
-        <w:t xml:space="preserve"> Man sagt nichts. Man nickt, stimmt zu, macht mit. Und trägt alles still in sich. Die Erschöpfung wächst, aber niemand weiss warum — nicht mal man selbst manchmal. Der Preis ist der stille Aufbau von Ressentiments: ein winziges Körnchen pro Situation, das sich über Jahre zu einer Last aufschichtet, die kaum noch zu tragen ist.</w:t>
+        <w:t xml:space="preserve"> Man sagt nichts. Man nickt, stimmt zu, macht mit. Und trägt alles still in sich. Die Erschöpfung wächst, aber niemand weiss warum, nicht mal man selbst manchmal. Der Preis ist der stille Aufbau von Ressentiments: ein winziges Körnchen pro Situation, das sich über Jahre zu einer Last aufschichtet, die kaum noch zu tragen ist.</w:t>
       </w:r>
     </w:p>
     <w:p>
@@ -7488,7 +7488,7 @@
         <w:t>Passiv-aggressiv:</w:t>
       </w:r>
       <w:r>
-        <w:t xml:space="preserve"> Man sagt nichts — direkt. Aber man straft auf andere Wege. Schweigen. Sarkasmus. Kleine Sticheleien. Plötzliche Kälte. Ein Seufzen, das mehr sagt als tausend Worte, aber nichts klärt. Das ist die komprimierte Wut, die keinen anderen Ausweg gefunden hat. Die andere Person spürt, dass etwas nicht stimmt, aber weiss nicht was. Das erzeugt Verwirrung und Abstand — genau das Gegenteil von dem, was man eigentlich braucht.</w:t>
+        <w:t xml:space="preserve"> Man sagt nichts direkt. Aber man straft auf andere Wege. Schweigen. Sarkasmus. Kleine Sticheleien. Plötzliche Kälte. Ein Seufzen, das mehr sagt als tausend Worte, aber nichts klärt. Das ist die komprimierte Wut, die keinen anderen Ausweg gefunden hat. Die andere Person spürt, dass etwas nicht stimmt, aber weiss nicht was. Das erzeugt Verwirrung und Abstand, genau das Gegenteil von dem, was man eigentlich braucht.</w:t>
       </w:r>
     </w:p>
     <w:p>
@@ -7503,7 +7503,7 @@
         <w:t>Explosiv:</w:t>
       </w:r>
       <w:r>
-        <w:t xml:space="preserve"> Man schweigt lange, hält aus, dann platzt es heraus — meist an einem Punkt, der zu klein ist für die gesammelte Energie dahinter. Man erschreckt sich selbst. Man entschuldigt sich. Der Kreislauf beginnt von vorne.</w:t>
+        <w:t xml:space="preserve"> Man schweigt lange, hält aus, dann platzt es heraus, meist an einem Punkt, der zu klein ist für die gesammelte Energie dahinter. Man erschreckt sich selbst. Man entschuldigt sich. Der Kreislauf beginnt von vorne.</w:t>
       </w:r>
     </w:p>
     <w:p>
@@ -7588,7 +7588,7 @@
         <w:ind w:firstLine="283"/>
       </w:pPr>
       <w:r>
-        <w:t>Claudia hatte neun Jahre geschwiegen. Neun Jahre Abende, an denen sie sich unsichtbar fühlte. Neun Jahre Ressentiments, die sich aufschichteten — gegen ihren Mann, der, wie sie mir später sagte, ahnungslos war.</w:t>
+        <w:t>Claudia hatte neun Jahre geschwiegen. Neun Jahre Abende, an denen sie sich unsichtbar fühlte. Neun Jahre Ressentiments, die sich aufschichteten: gegen ihren Mann, der, wie sie mir später sagte, ahnungslos war.</w:t>
       </w:r>
     </w:p>
     <w:p>
@@ -7617,7 +7617,7 @@
         <w:ind w:firstLine="283"/>
       </w:pPr>
       <w:r>
-        <w:t>Claudia hat das Gespräch gesucht. Mit echten Worten. „Ich vermisse es, wenn du abends fragst, wie mein Tag war. Nicht was passiert ist — sondern wirklich: wie es mir geht." Ihr Mann war überrascht. Er hatte nicht gemerkt, dass ihr das so wichtig war. Er fing an zu fragen.</w:t>
+        <w:t>Claudia hat das Gespräch gesucht. Mit echten Worten. „Ich vermisse es, wenn du abends fragst, wie mein Tag war. Nicht was passiert ist, sondern wirklich: wie es mir geht." Ihr Mann war überrascht. Er hatte nicht gemerkt, dass ihr das so wichtig war. Er fing an zu fragen.</w:t>
       </w:r>
     </w:p>
     <w:p>
@@ -7649,7 +7649,7 @@
         <w:ind w:firstLine="283"/>
       </w:pPr>
       <w:r>
-        <w:t>Nicht weil man immer nach Schema F vorgehen muss, sondern weil die Struktur hilft, den Kopf zu klären — und den anderen nicht in die Defensive zu treiben.</w:t>
+        <w:t>Nicht weil man immer nach Schema F vorgehen muss, sondern weil die Struktur hilft, den Kopf zu klären, und den anderen nicht in die Defensive zu treiben.</w:t>
       </w:r>
     </w:p>
     <w:p>
@@ -7703,7 +7703,7 @@
         <w:ind w:firstLine="283"/>
       </w:pPr>
       <w:r>
-        <w:t>Das ist dein Gefühl. Das gehört dir. Das kann dir niemand wegnehmen oder widerlegen. Und es gibt dem anderen etwas, das keine Attacke ist — sondern eine ehrliche Information.</w:t>
+        <w:t>Das ist dein Gefühl. Das gehört dir. Das kann dir niemand wegnehmen oder widerlegen. Und es gibt dem anderen etwas, das keine Attacke ist, sondern eine ehrliche Information.</w:t>
       </w:r>
     </w:p>
     <w:p>
@@ -7718,7 +7718,7 @@
         <w:t>Bedürfnis nennen.</w:t>
       </w:r>
       <w:r>
-        <w:t xml:space="preserve"> „Ich brauche manchmal Abende, wo wir wirklich miteinander reden. Wo ich das Gefühl habe, dass wir uns berühren — nicht nur nebeneinander existieren."</w:t>
+        <w:t xml:space="preserve"> „Ich brauche manchmal Abende, wo wir wirklich miteinander reden. Wo ich das Gefühl habe, dass wir uns berühren, nicht nur nebeneinander existieren."</w:t>
       </w:r>
     </w:p>
     <w:p>
@@ -7749,7 +7749,7 @@
         <w:ind w:firstLine="283"/>
       </w:pPr>
       <w:r>
-        <w:t>Eine konkrete, erfüllbare Bitte. Keine Forderung, kein Ultimatum. Eine Einladung. Der andere kann ja oder nein sagen — und wenn er nein sagt, ist das auch eine Information.</w:t>
+        <w:t>Eine konkrete, erfüllbare Bitte. Keine Forderung, kein Ultimatum. Eine Einladung. Der andere kann ja oder nein sagen, und wenn er nein sagt, ist das auch eine Information.</w:t>
       </w:r>
     </w:p>
     <w:p>
@@ -7847,7 +7847,7 @@
         <w:ind w:firstLine="283"/>
       </w:pPr>
       <w:r>
-        <w:t>Keine dramatische Szene. Kein Streit. Kein Beziehungsende. Nur die Wahrheit — und eine Freundin, die sie hören konnte.</w:t>
+        <w:t>Keine dramatische Szene. Kein Streit. Kein Beziehungsende. Nur die Wahrheit, und eine Freundin, die sie hören konnte.</w:t>
       </w:r>
     </w:p>
     <w:p>
@@ -7928,7 +7928,7 @@
           <w:i/>
           <w:sz w:val="21"/>
         </w:rPr>
-        <w:t>„Ich möchte dir ehrlich sagen, wie ich das sehe — auch wenn es vielleicht unbequem ist."</w:t>
+        <w:t>„Ich möchte dir ehrlich sagen, wie ich das sehe, auch wenn es vielleicht unbequem ist."</w:t>
       </w:r>
     </w:p>
     <w:p>
@@ -7962,7 +7962,7 @@
         <w:ind w:firstLine="283"/>
       </w:pPr>
       <w:r>
-        <w:t>Diese Sätze klingen einfach. Sie sind es nicht, wenn man nie gelernt hat, sie zu sagen. Aber sie sind erlernbar. Und jedes Mal, wenn man einen dieser Sätze ausspricht, passiert zweierlei: Man nimmt sich selbst als jemanden ernst, dessen Gedanken und Grenzen eine Rolle spielen. Und man gibt der anderen Person die Möglichkeit, wirklich mit einem in Beziehung zu sein — nicht nur mit dem, was man von sich zeigen durfte.</w:t>
+        <w:t>Diese Sätze klingen einfach. Sie sind es nicht, wenn man nie gelernt hat, sie zu sagen. Aber sie sind erlernbar. Und jedes Mal, wenn man einen dieser Sätze ausspricht, passiert zweierlei: Man nimmt sich selbst als jemanden ernst, dessen Gedanken und Grenzen eine Rolle spielen. Und man gibt der anderen Person die Möglichkeit, wirklich mit einem in Beziehung zu sein, nicht nur mit dem, was man von sich zeigen durfte.</w:t>
       </w:r>
     </w:p>
     <w:p>
@@ -8010,7 +8010,7 @@
         <w:ind w:firstLine="283"/>
       </w:pPr>
       <w:r>
-        <w:t>Echter Friede entsteht nicht durch Vermeidung. Er entsteht durch Gespräche, die manchmal unbequem sind — und dann gemeinsam zu einem Ort führen, der wirklicher ist als alles Davor.</w:t>
+        <w:t>Echter Friede entsteht nicht durch Vermeidung. Er entsteht durch Gespräche, die manchmal unbequem sind, und dann gemeinsam zu einem Ort führen, der wirklicher ist als alles Davor.</w:t>
       </w:r>
     </w:p>
     <w:p>
@@ -8042,7 +8042,7 @@
         <w:ind w:firstLine="283"/>
       </w:pPr>
       <w:r>
-        <w:t>Falls du dir jetzt denkst: Das klingt gut, aber ich weiss nicht, wie ich anfangen soll — hier ist ein konkreter Vorschlag.</w:t>
+        <w:t>Falls du dir jetzt denkst: Das klingt gut, aber ich weiss nicht, wie ich anfangen soll: Hier ist ein konkreter Vorschlag.</w:t>
       </w:r>
     </w:p>
     <w:p>
@@ -8121,7 +8121,7 @@
           <w:i/>
           <w:sz w:val="21"/>
         </w:rPr>
-        <w:t>„Was wäre ein Satz, den ich schon lange sagen möchte — und noch nicht gesagt habe?"</w:t>
+        <w:t>„Was wäre ein Satz, den ich schon lange sagen möchte, und noch nicht gesagt habe?"</w:t>
       </w:r>
     </w:p>
     <w:p>
@@ -8134,7 +8134,7 @@
           <w:i/>
           <w:sz w:val="21"/>
         </w:rPr>
-        <w:t>„Welche Beziehung in meinem Leben würde von mehr Ehrlichkeit profitieren — auch wenn es kurzfristig unbequem wäre?"</w:t>
+        <w:t>„Welche Beziehung in meinem Leben würde von mehr Ehrlichkeit profitieren, auch wenn es kurzfristig unbequem wäre?"</w:t>
       </w:r>
     </w:p>
     <w:p>
@@ -8293,7 +8293,7 @@
         <w:ind w:firstLine="283"/>
       </w:pPr>
       <w:r>
-        <w:t>Dieses Buch wäre nicht entstanden ohne die Frauen, die mir über die Jahre ihr Vertrauen geschenkt haben. Die in meine Praxis kamen, die ehrlich waren, die sich gezeigt haben — auch wenn es ihnen schwer fiel. Ich habe von ihnen mehr gelernt als aus jedem Fachbuch.</w:t>
+        <w:t>Dieses Buch wäre nicht entstanden ohne die Frauen, die mir über die Jahre ihr Vertrauen geschenkt haben. Die in meine Praxis kamen, die ehrlich waren, die sich gezeigt haben, auch wenn es ihnen schwer fiel. Ich habe von ihnen mehr gelernt als aus jedem Fachbuch.</w:t>
       </w:r>
     </w:p>
     <w:p>
@@ -8391,7 +8391,7 @@
         <w:ind w:firstLine="283"/>
       </w:pPr>
       <w:r>
-        <w:t>Wenn du merkst, dass du tiefer gehen möchtest — dass du Begleitung suchst, konkrete Werkzeuge, eine Gemeinschaft von Frauen auf demselben Weg — dann gibt es Möglichkeiten, den nächsten Schritt zu gehen.</w:t>
+        <w:t>Wenn du merkst, dass du tiefer gehen möchtest, dass du Begleitung suchst, konkrete Werkzeuge, eine Gemeinschaft von Frauen auf demselben Weg, dann gibt es Möglichkeiten, den nächsten Schritt zu gehen.</w:t>
       </w:r>
     </w:p>
     <w:p>

</xml_diff>

<commit_message>
Replace private email with Gmail contact in manuscript and backmatter
</commit_message>
<xml_diff>
--- a/outputs/buch-beziehungen/wenn-beziehungen-erschoepfen-KDP.docx
+++ b/outputs/buch-beziehungen/wenn-beziehungen-erschoepfen-KDP.docx
@@ -12858,7 +12858,7 @@
           <w:b/>
           <w:i w:val="0"/>
         </w:rPr>
-        <w:t>tanner.pe@bluewin.ch</w:t>
+        <w:t>beyondlimitsnow25@gmail.com</w:t>
       </w:r>
     </w:p>
     <w:p>
@@ -13438,7 +13438,7 @@
           <w:b w:val="0"/>
           <w:i w:val="0"/>
         </w:rPr>
-        <w:t xml:space="preserve"> tanner.pe@bluewin.ch</w:t>
+        <w:t xml:space="preserve"> beyondlimitsnow25@gmail.com</w:t>
       </w:r>
     </w:p>
     <w:sectPr>

</xml_diff>

<commit_message>
Kontaktadresse in allen Buechern und Vorlagen auf info.safetothrive@gmail.com umgestellt
Ersetzt beyondlimitsnow25@gmail.com ueberall: Manuskripte (docx + md) von
Buch 3, 4, 6, Standardvorlagen (buch-standard.md, rechtssicherheit.md,
business.md, kdp-buch-produktion.md, ueber-mich.md, CLAUDE.md), Tools
(buch-pruefen.py, buch6-ebook.py) und offene-punkte.md. Buch 6 PDF und
eBook neu gebaut, Seitenzahl unveraendert (111), kein Cover-Rebuild noetig.

Buch 5 (niemand-hat-dich-gefragt) hat kein docx-Quelldokument in diesem
Repo - nur die .md-Quelle aktualisiert, das bestehende PDF enthaelt noch
die alte Adresse und muss separat neu erzeugt werden.
Buch 1 (ADHD-Planner) und Buch 2 (Sucht-Kalender) haben keine
Manuskript-Dateien in diesem Repo, konnten nicht aktualisiert werden.
</commit_message>
<xml_diff>
--- a/outputs/buch-beziehungen/wenn-beziehungen-erschoepfen-KDP.docx
+++ b/outputs/buch-beziehungen/wenn-beziehungen-erschoepfen-KDP.docx
@@ -12858,7 +12858,7 @@
           <w:b/>
           <w:i w:val="0"/>
         </w:rPr>
-        <w:t>beyondlimitsnow25@gmail.com</w:t>
+        <w:t>info.safetothrive@gmail.com</w:t>
       </w:r>
     </w:p>
     <w:p>
@@ -13438,7 +13438,7 @@
           <w:b w:val="0"/>
           <w:i w:val="0"/>
         </w:rPr>
-        <w:t xml:space="preserve"> beyondlimitsnow25@gmail.com</w:t>
+        <w:t xml:space="preserve"> info.safetothrive@gmail.com</w:t>
       </w:r>
     </w:p>
     <w:sectPr>

</xml_diff>